<commit_message>
Report update and placeholder files addition to iteration folders
</commit_message>
<xml_diff>
--- a/Documentation/Iteration01/relatorio_gestao_pilotos_fsoft.docx
+++ b/Documentation/Iteration01/relatorio_gestao_pilotos_fsoft.docx
@@ -5,6 +5,7 @@
     <w:p>
       <w:pPr>
         <w:spacing w:after="200"/>
+        <w:ind w:left="708" w:hanging="708"/>
         <w:jc w:val="center"/>
       </w:pPr>
       <w:r>
@@ -23,13 +24,7 @@
         <w:jc w:val="center"/>
       </w:pPr>
       <w:r>
-        <w:t xml:space="preserve">Class: 1DD   </w:t>
-      </w:r>
-      <w:r>
-        <w:t xml:space="preserve">Grupo </w:t>
-      </w:r>
-      <w:r>
-        <w:t>3</w:t>
+        <w:t>Class: 1DD   Grupo 3</w:t>
       </w:r>
     </w:p>
     <w:p>
@@ -59,7 +54,27 @@
           <w:sz w:val="18"/>
           <w:szCs w:val="18"/>
         </w:rPr>
-        <w:t>LETI — Licenciatura em Engenharia de Telecomunicações e Informática  |  2025/26</w:t>
+        <w:t xml:space="preserve">LETI — Licenciatura em Engenharia de Telecomunicações e </w:t>
+      </w:r>
+      <w:proofErr w:type="gramStart"/>
+      <w:r>
+        <w:rPr>
+          <w:i/>
+          <w:iCs/>
+          <w:sz w:val="18"/>
+          <w:szCs w:val="18"/>
+        </w:rPr>
+        <w:t>Informática  |</w:t>
+      </w:r>
+      <w:proofErr w:type="gramEnd"/>
+      <w:r>
+        <w:rPr>
+          <w:i/>
+          <w:iCs/>
+          <w:sz w:val="18"/>
+          <w:szCs w:val="18"/>
+        </w:rPr>
+        <w:t xml:space="preserve">  2025/26</w:t>
       </w:r>
     </w:p>
     <w:p>
@@ -67,6 +82,7 @@
         <w:spacing w:before="200" w:after="80"/>
         <w:ind w:left="720" w:right="720"/>
       </w:pPr>
+      <w:proofErr w:type="spellStart"/>
       <w:r>
         <w:rPr>
           <w:b/>
@@ -74,14 +90,47 @@
           <w:sz w:val="18"/>
           <w:szCs w:val="18"/>
         </w:rPr>
-        <w:t xml:space="preserve">Abstract. </w:t>
-      </w:r>
-      <w:r>
-        <w:rPr>
-          <w:sz w:val="18"/>
-          <w:szCs w:val="18"/>
-        </w:rPr>
-        <w:t>Este documento apresenta a análise de requisitos e a arquitetura de um sistema de gestão de pilotos de automobilismo, desenvolvido como aplicação de linha de comandos (CLI) em C++. O projeto encontra-se organizado em três iterações dentro da pasta Documentation, sendo a Iteração 01 a que contém os artefactos UML produzidos nesta fase: diagrama de domínio, casos de uso, diagramas de sequência do sistema (SSD), diagrama de classes e diagrama de pacotes. Os dados são persistidos em ficheiros binários, seguindo as restrições da unidade curricular Fundamentos de Desenvolvimento de Software (FSOFT) do ISEP.</w:t>
+        <w:t>Abstract</w:t>
+      </w:r>
+      <w:proofErr w:type="spellEnd"/>
+      <w:r>
+        <w:rPr>
+          <w:b/>
+          <w:bCs/>
+          <w:sz w:val="18"/>
+          <w:szCs w:val="18"/>
+        </w:rPr>
+        <w:t xml:space="preserve">. </w:t>
+      </w:r>
+      <w:r>
+        <w:rPr>
+          <w:sz w:val="18"/>
+          <w:szCs w:val="18"/>
+        </w:rPr>
+        <w:t xml:space="preserve">Este documento apresenta a análise de requisitos e a arquitetura de um sistema de gestão de pilotos de automobilismo, desenvolvido como aplicação de linha de comandos (CLI) em C++. O projeto encontra-se organizado em três iterações dentro da pasta </w:t>
+      </w:r>
+      <w:proofErr w:type="spellStart"/>
+      <w:r>
+        <w:rPr>
+          <w:sz w:val="18"/>
+          <w:szCs w:val="18"/>
+        </w:rPr>
+        <w:t>Documentation</w:t>
+      </w:r>
+      <w:proofErr w:type="spellEnd"/>
+      <w:r>
+        <w:rPr>
+          <w:sz w:val="18"/>
+          <w:szCs w:val="18"/>
+        </w:rPr>
+        <w:t>, sendo a Iteração 01 a que contém os artefactos UML produzidos nesta fase: diagrama de domínio, casos de uso, diagramas de sequência do sistema (SSD), diagrama de classes e diagrama de pacotes. Os dados são persistidos em ficheiros binários, seguin</w:t>
+      </w:r>
+      <w:r>
+        <w:rPr>
+          <w:sz w:val="18"/>
+          <w:szCs w:val="18"/>
+        </w:rPr>
+        <w:t>do as restrições da unidade curricular Fundamentos de Desenvolvimento de Software (FSOFT) do ISEP.</w:t>
       </w:r>
     </w:p>
     <w:p>
@@ -89,6 +138,7 @@
         <w:spacing w:before="80" w:after="200"/>
         <w:ind w:left="720" w:right="720"/>
       </w:pPr>
+      <w:proofErr w:type="spellStart"/>
       <w:r>
         <w:rPr>
           <w:b/>
@@ -96,14 +146,40 @@
           <w:sz w:val="18"/>
           <w:szCs w:val="18"/>
         </w:rPr>
-        <w:t xml:space="preserve">Keywords: </w:t>
-      </w:r>
-      <w:r>
-        <w:rPr>
-          <w:sz w:val="18"/>
-          <w:szCs w:val="18"/>
-        </w:rPr>
-        <w:t>automobilismo, gestão de pilotos, C++, CLI, UML, análise de requisitos, PlantUML.</w:t>
+        <w:t>Keywords</w:t>
+      </w:r>
+      <w:proofErr w:type="spellEnd"/>
+      <w:r>
+        <w:rPr>
+          <w:b/>
+          <w:bCs/>
+          <w:sz w:val="18"/>
+          <w:szCs w:val="18"/>
+        </w:rPr>
+        <w:t xml:space="preserve">: </w:t>
+      </w:r>
+      <w:r>
+        <w:rPr>
+          <w:sz w:val="18"/>
+          <w:szCs w:val="18"/>
+        </w:rPr>
+        <w:t xml:space="preserve">automobilismo, gestão de pilotos, C++, CLI, UML, análise de requisitos, </w:t>
+      </w:r>
+      <w:proofErr w:type="spellStart"/>
+      <w:r>
+        <w:rPr>
+          <w:sz w:val="18"/>
+          <w:szCs w:val="18"/>
+        </w:rPr>
+        <w:t>PlantUML</w:t>
+      </w:r>
+      <w:proofErr w:type="spellEnd"/>
+      <w:r>
+        <w:rPr>
+          <w:sz w:val="18"/>
+          <w:szCs w:val="18"/>
+        </w:rPr>
+        <w:t>.</w:t>
       </w:r>
     </w:p>
     <w:p>
@@ -300,12 +376,6 @@
         <w:gridCol w:w="6319"/>
       </w:tblGrid>
       <w:tr>
-        <w:tblPrEx>
-          <w:tblCellMar>
-            <w:top w:w="0" w:type="dxa"/>
-            <w:bottom w:w="0" w:type="dxa"/>
-          </w:tblCellMar>
-        </w:tblPrEx>
         <w:tc>
           <w:tcPr>
             <w:tcW w:w="2707" w:type="dxa"/>
@@ -362,12 +432,6 @@
         </w:tc>
       </w:tr>
       <w:tr>
-        <w:tblPrEx>
-          <w:tblCellMar>
-            <w:top w:w="0" w:type="dxa"/>
-            <w:bottom w:w="0" w:type="dxa"/>
-          </w:tblCellMar>
-        </w:tblPrEx>
         <w:tc>
           <w:tcPr>
             <w:tcW w:w="2707" w:type="dxa"/>
@@ -422,12 +486,6 @@
         </w:tc>
       </w:tr>
       <w:tr>
-        <w:tblPrEx>
-          <w:tblCellMar>
-            <w:top w:w="0" w:type="dxa"/>
-            <w:bottom w:w="0" w:type="dxa"/>
-          </w:tblCellMar>
-        </w:tblPrEx>
         <w:tc>
           <w:tcPr>
             <w:tcW w:w="2707" w:type="dxa"/>
@@ -476,12 +534,6 @@
         </w:tc>
       </w:tr>
       <w:tr>
-        <w:tblPrEx>
-          <w:tblCellMar>
-            <w:top w:w="0" w:type="dxa"/>
-            <w:bottom w:w="0" w:type="dxa"/>
-          </w:tblCellMar>
-        </w:tblPrEx>
         <w:tc>
           <w:tcPr>
             <w:tcW w:w="2707" w:type="dxa"/>
@@ -530,12 +582,6 @@
         </w:tc>
       </w:tr>
       <w:tr>
-        <w:tblPrEx>
-          <w:tblCellMar>
-            <w:top w:w="0" w:type="dxa"/>
-            <w:bottom w:w="0" w:type="dxa"/>
-          </w:tblCellMar>
-        </w:tblPrEx>
         <w:tc>
           <w:tcPr>
             <w:tcW w:w="2707" w:type="dxa"/>
@@ -604,7 +650,36 @@
         <w:jc w:val="both"/>
       </w:pPr>
       <w:r>
-        <w:t xml:space="preserve">O repositório Git está organizado da seguinte forma. A raiz contém o ficheiro .gitignore que exclui pastas geradas pelo CLion e pelo CMake, mantendo apenas os </w:t>
+        <w:t xml:space="preserve">O repositório </w:t>
+      </w:r>
+      <w:proofErr w:type="spellStart"/>
+      <w:r>
+        <w:t>Git</w:t>
+      </w:r>
+      <w:proofErr w:type="spellEnd"/>
+      <w:r>
+        <w:t xml:space="preserve"> está organizado da seguinte forma. A raiz contém o </w:t>
+      </w:r>
+      <w:proofErr w:type="gramStart"/>
+      <w:r>
+        <w:t>ficheiro .</w:t>
+      </w:r>
+      <w:proofErr w:type="spellStart"/>
+      <w:r>
+        <w:t>gitignore</w:t>
+      </w:r>
+      <w:proofErr w:type="spellEnd"/>
+      <w:proofErr w:type="gramEnd"/>
+      <w:r>
+        <w:t xml:space="preserve"> que exclui pastas geradas pelo </w:t>
+      </w:r>
+      <w:proofErr w:type="spellStart"/>
+      <w:r>
+        <w:t>CLion</w:t>
+      </w:r>
+      <w:proofErr w:type="spellEnd"/>
+      <w:r>
+        <w:t xml:space="preserve"> e pelo CMake, mantendo apenas os </w:t>
       </w:r>
       <w:r>
         <w:t>pastas/ficheiros</w:t>
@@ -648,8 +723,28 @@
           <w:sz w:val="18"/>
           <w:szCs w:val="18"/>
         </w:rPr>
-        <w:t>│   .gitignore</w:t>
-      </w:r>
+        <w:t xml:space="preserve">│ </w:t>
+      </w:r>
+      <w:proofErr w:type="gramStart"/>
+      <w:r>
+        <w:rPr>
+          <w:rFonts w:ascii="Courier New" w:eastAsia="Courier New" w:hAnsi="Courier New" w:cs="Courier New"/>
+          <w:sz w:val="18"/>
+          <w:szCs w:val="18"/>
+        </w:rPr>
+        <w:t xml:space="preserve">  .</w:t>
+      </w:r>
+      <w:proofErr w:type="spellStart"/>
+      <w:r>
+        <w:rPr>
+          <w:rFonts w:ascii="Courier New" w:eastAsia="Courier New" w:hAnsi="Courier New" w:cs="Courier New"/>
+          <w:sz w:val="18"/>
+          <w:szCs w:val="18"/>
+        </w:rPr>
+        <w:t>gitignore</w:t>
+      </w:r>
+      <w:proofErr w:type="spellEnd"/>
+      <w:proofErr w:type="gramEnd"/>
     </w:p>
     <w:p>
       <w:pPr>
@@ -686,8 +781,18 @@
           <w:sz w:val="18"/>
           <w:szCs w:val="18"/>
         </w:rPr>
-        <w:t>├───Documentation</w:t>
-      </w:r>
+        <w:t>├───</w:t>
+      </w:r>
+      <w:proofErr w:type="spellStart"/>
+      <w:r>
+        <w:rPr>
+          <w:rFonts w:ascii="Courier New" w:eastAsia="Courier New" w:hAnsi="Courier New" w:cs="Courier New"/>
+          <w:sz w:val="18"/>
+          <w:szCs w:val="18"/>
+        </w:rPr>
+        <w:t>Documentation</w:t>
+      </w:r>
+      <w:proofErr w:type="spellEnd"/>
     </w:p>
     <w:p>
       <w:pPr>
@@ -724,8 +829,28 @@
           <w:sz w:val="18"/>
           <w:szCs w:val="18"/>
         </w:rPr>
-        <w:t>│   │       class_diagram.puml</w:t>
-      </w:r>
+        <w:t xml:space="preserve">│   │       </w:t>
+      </w:r>
+      <w:proofErr w:type="spellStart"/>
+      <w:r>
+        <w:rPr>
+          <w:rFonts w:ascii="Courier New" w:eastAsia="Courier New" w:hAnsi="Courier New" w:cs="Courier New"/>
+          <w:sz w:val="18"/>
+          <w:szCs w:val="18"/>
+        </w:rPr>
+        <w:t>class_</w:t>
+      </w:r>
+      <w:proofErr w:type="gramStart"/>
+      <w:r>
+        <w:rPr>
+          <w:rFonts w:ascii="Courier New" w:eastAsia="Courier New" w:hAnsi="Courier New" w:cs="Courier New"/>
+          <w:sz w:val="18"/>
+          <w:szCs w:val="18"/>
+        </w:rPr>
+        <w:t>diagram.puml</w:t>
+      </w:r>
+      <w:proofErr w:type="spellEnd"/>
+      <w:proofErr w:type="gramEnd"/>
     </w:p>
     <w:p>
       <w:pPr>
@@ -743,8 +868,28 @@
           <w:sz w:val="18"/>
           <w:szCs w:val="18"/>
         </w:rPr>
-        <w:t>│   │       domain_model.puml</w:t>
-      </w:r>
+        <w:t xml:space="preserve">│   │       </w:t>
+      </w:r>
+      <w:proofErr w:type="spellStart"/>
+      <w:r>
+        <w:rPr>
+          <w:rFonts w:ascii="Courier New" w:eastAsia="Courier New" w:hAnsi="Courier New" w:cs="Courier New"/>
+          <w:sz w:val="18"/>
+          <w:szCs w:val="18"/>
+        </w:rPr>
+        <w:t>domain_</w:t>
+      </w:r>
+      <w:proofErr w:type="gramStart"/>
+      <w:r>
+        <w:rPr>
+          <w:rFonts w:ascii="Courier New" w:eastAsia="Courier New" w:hAnsi="Courier New" w:cs="Courier New"/>
+          <w:sz w:val="18"/>
+          <w:szCs w:val="18"/>
+        </w:rPr>
+        <w:t>model.puml</w:t>
+      </w:r>
+      <w:proofErr w:type="spellEnd"/>
+      <w:proofErr w:type="gramEnd"/>
     </w:p>
     <w:p>
       <w:pPr>
@@ -762,8 +907,28 @@
           <w:sz w:val="18"/>
           <w:szCs w:val="18"/>
         </w:rPr>
-        <w:t>│   │       package_diagram.puml</w:t>
-      </w:r>
+        <w:t xml:space="preserve">│   │       </w:t>
+      </w:r>
+      <w:proofErr w:type="spellStart"/>
+      <w:r>
+        <w:rPr>
+          <w:rFonts w:ascii="Courier New" w:eastAsia="Courier New" w:hAnsi="Courier New" w:cs="Courier New"/>
+          <w:sz w:val="18"/>
+          <w:szCs w:val="18"/>
+        </w:rPr>
+        <w:t>package_</w:t>
+      </w:r>
+      <w:proofErr w:type="gramStart"/>
+      <w:r>
+        <w:rPr>
+          <w:rFonts w:ascii="Courier New" w:eastAsia="Courier New" w:hAnsi="Courier New" w:cs="Courier New"/>
+          <w:sz w:val="18"/>
+          <w:szCs w:val="18"/>
+        </w:rPr>
+        <w:t>diagram.puml</w:t>
+      </w:r>
+      <w:proofErr w:type="spellEnd"/>
+      <w:proofErr w:type="gramEnd"/>
     </w:p>
     <w:p>
       <w:pPr>
@@ -781,8 +946,28 @@
           <w:sz w:val="18"/>
           <w:szCs w:val="18"/>
         </w:rPr>
-        <w:t>│   │       ssd_consultar_classificacao.puml</w:t>
-      </w:r>
+        <w:t xml:space="preserve">│   │       </w:t>
+      </w:r>
+      <w:proofErr w:type="spellStart"/>
+      <w:r>
+        <w:rPr>
+          <w:rFonts w:ascii="Courier New" w:eastAsia="Courier New" w:hAnsi="Courier New" w:cs="Courier New"/>
+          <w:sz w:val="18"/>
+          <w:szCs w:val="18"/>
+        </w:rPr>
+        <w:t>ssd_consultar_</w:t>
+      </w:r>
+      <w:proofErr w:type="gramStart"/>
+      <w:r>
+        <w:rPr>
+          <w:rFonts w:ascii="Courier New" w:eastAsia="Courier New" w:hAnsi="Courier New" w:cs="Courier New"/>
+          <w:sz w:val="18"/>
+          <w:szCs w:val="18"/>
+        </w:rPr>
+        <w:t>classificacao.puml</w:t>
+      </w:r>
+      <w:proofErr w:type="spellEnd"/>
+      <w:proofErr w:type="gramEnd"/>
     </w:p>
     <w:p>
       <w:pPr>
@@ -800,8 +985,28 @@
           <w:sz w:val="18"/>
           <w:szCs w:val="18"/>
         </w:rPr>
-        <w:t>│   │       ssd_criar_piloto.puml</w:t>
-      </w:r>
+        <w:t xml:space="preserve">│   │       </w:t>
+      </w:r>
+      <w:proofErr w:type="spellStart"/>
+      <w:r>
+        <w:rPr>
+          <w:rFonts w:ascii="Courier New" w:eastAsia="Courier New" w:hAnsi="Courier New" w:cs="Courier New"/>
+          <w:sz w:val="18"/>
+          <w:szCs w:val="18"/>
+        </w:rPr>
+        <w:t>ssd_criar_</w:t>
+      </w:r>
+      <w:proofErr w:type="gramStart"/>
+      <w:r>
+        <w:rPr>
+          <w:rFonts w:ascii="Courier New" w:eastAsia="Courier New" w:hAnsi="Courier New" w:cs="Courier New"/>
+          <w:sz w:val="18"/>
+          <w:szCs w:val="18"/>
+        </w:rPr>
+        <w:t>piloto.puml</w:t>
+      </w:r>
+      <w:proofErr w:type="spellEnd"/>
+      <w:proofErr w:type="gramEnd"/>
     </w:p>
     <w:p>
       <w:pPr>
@@ -819,8 +1024,28 @@
           <w:sz w:val="18"/>
           <w:szCs w:val="18"/>
         </w:rPr>
-        <w:t>│   │       ssd_registar_participacao.puml</w:t>
-      </w:r>
+        <w:t xml:space="preserve">│   │       </w:t>
+      </w:r>
+      <w:proofErr w:type="spellStart"/>
+      <w:r>
+        <w:rPr>
+          <w:rFonts w:ascii="Courier New" w:eastAsia="Courier New" w:hAnsi="Courier New" w:cs="Courier New"/>
+          <w:sz w:val="18"/>
+          <w:szCs w:val="18"/>
+        </w:rPr>
+        <w:t>ssd_registar_</w:t>
+      </w:r>
+      <w:proofErr w:type="gramStart"/>
+      <w:r>
+        <w:rPr>
+          <w:rFonts w:ascii="Courier New" w:eastAsia="Courier New" w:hAnsi="Courier New" w:cs="Courier New"/>
+          <w:sz w:val="18"/>
+          <w:szCs w:val="18"/>
+        </w:rPr>
+        <w:t>participacao.puml</w:t>
+      </w:r>
+      <w:proofErr w:type="spellEnd"/>
+      <w:proofErr w:type="gramEnd"/>
     </w:p>
     <w:p>
       <w:pPr>
@@ -838,8 +1063,28 @@
           <w:sz w:val="18"/>
           <w:szCs w:val="18"/>
         </w:rPr>
-        <w:t>│   │       use_cases.puml</w:t>
-      </w:r>
+        <w:t xml:space="preserve">│   │       </w:t>
+      </w:r>
+      <w:proofErr w:type="spellStart"/>
+      <w:r>
+        <w:rPr>
+          <w:rFonts w:ascii="Courier New" w:eastAsia="Courier New" w:hAnsi="Courier New" w:cs="Courier New"/>
+          <w:sz w:val="18"/>
+          <w:szCs w:val="18"/>
+        </w:rPr>
+        <w:t>use_</w:t>
+      </w:r>
+      <w:proofErr w:type="gramStart"/>
+      <w:r>
+        <w:rPr>
+          <w:rFonts w:ascii="Courier New" w:eastAsia="Courier New" w:hAnsi="Courier New" w:cs="Courier New"/>
+          <w:sz w:val="18"/>
+          <w:szCs w:val="18"/>
+        </w:rPr>
+        <w:t>cases.puml</w:t>
+      </w:r>
+      <w:proofErr w:type="spellEnd"/>
+      <w:proofErr w:type="gramEnd"/>
     </w:p>
     <w:p>
       <w:pPr>
@@ -1045,7 +1290,49 @@
         <w:jc w:val="both"/>
       </w:pPr>
       <w:r>
-        <w:t>As pastas .idea e cmake-build-debug, são geradas automaticamente pelo CLion e pelo CMake e estão excluídas do repositório através do .gitignore.</w:t>
+        <w:t xml:space="preserve">As </w:t>
+      </w:r>
+      <w:proofErr w:type="gramStart"/>
+      <w:r>
+        <w:t>pastas .</w:t>
+      </w:r>
+      <w:proofErr w:type="spellStart"/>
+      <w:r>
+        <w:t>idea</w:t>
+      </w:r>
+      <w:proofErr w:type="spellEnd"/>
+      <w:proofErr w:type="gramEnd"/>
+      <w:r>
+        <w:t xml:space="preserve"> e </w:t>
+      </w:r>
+      <w:proofErr w:type="spellStart"/>
+      <w:r>
+        <w:t>cmake-build-debug</w:t>
+      </w:r>
+      <w:proofErr w:type="spellEnd"/>
+      <w:r>
+        <w:t xml:space="preserve">, são geradas automaticamente pelo </w:t>
+      </w:r>
+      <w:proofErr w:type="spellStart"/>
+      <w:r>
+        <w:t>CLion</w:t>
+      </w:r>
+      <w:proofErr w:type="spellEnd"/>
+      <w:r>
+        <w:t xml:space="preserve"> e pelo CMake e estão excluídas do repositório através </w:t>
+      </w:r>
+      <w:proofErr w:type="gramStart"/>
+      <w:r>
+        <w:t>do .</w:t>
+      </w:r>
+      <w:proofErr w:type="spellStart"/>
+      <w:r>
+        <w:t>gitignore</w:t>
+      </w:r>
+      <w:proofErr w:type="spellEnd"/>
+      <w:proofErr w:type="gramEnd"/>
+      <w:r>
+        <w:t>.</w:t>
       </w:r>
     </w:p>
     <w:p>
@@ -1068,7 +1355,20 @@
         <w:jc w:val="both"/>
       </w:pPr>
       <w:r>
-        <w:t>O modelo de domínio (ficheiro domain_model.puml) identifica as entidades relevantes do sistema e as relações entre elas, servindo de base para o desenho das classes de implementação.</w:t>
+        <w:t xml:space="preserve">O modelo de domínio (ficheiro </w:t>
+      </w:r>
+      <w:proofErr w:type="spellStart"/>
+      <w:r>
+        <w:t>domain_</w:t>
+      </w:r>
+      <w:proofErr w:type="gramStart"/>
+      <w:r>
+        <w:t>model.puml</w:t>
+      </w:r>
+      <w:proofErr w:type="spellEnd"/>
+      <w:proofErr w:type="gramEnd"/>
+      <w:r>
+        <w:t>) identifica as entidades relevantes do sistema e as relações entre elas, servindo de base para o desenho das classes de implementação.</w:t>
       </w:r>
     </w:p>
     <w:p>
@@ -1167,12 +1467,6 @@
         <w:gridCol w:w="6319"/>
       </w:tblGrid>
       <w:tr>
-        <w:tblPrEx>
-          <w:tblCellMar>
-            <w:top w:w="0" w:type="dxa"/>
-            <w:bottom w:w="0" w:type="dxa"/>
-          </w:tblCellMar>
-        </w:tblPrEx>
         <w:tc>
           <w:tcPr>
             <w:tcW w:w="2707" w:type="dxa"/>
@@ -1229,12 +1523,6 @@
         </w:tc>
       </w:tr>
       <w:tr>
-        <w:tblPrEx>
-          <w:tblCellMar>
-            <w:top w:w="0" w:type="dxa"/>
-            <w:bottom w:w="0" w:type="dxa"/>
-          </w:tblCellMar>
-        </w:tblPrEx>
         <w:tc>
           <w:tcPr>
             <w:tcW w:w="2707" w:type="dxa"/>
@@ -1283,12 +1571,6 @@
         </w:tc>
       </w:tr>
       <w:tr>
-        <w:tblPrEx>
-          <w:tblCellMar>
-            <w:top w:w="0" w:type="dxa"/>
-            <w:bottom w:w="0" w:type="dxa"/>
-          </w:tblCellMar>
-        </w:tblPrEx>
         <w:tc>
           <w:tcPr>
             <w:tcW w:w="2707" w:type="dxa"/>
@@ -1337,12 +1619,6 @@
         </w:tc>
       </w:tr>
       <w:tr>
-        <w:tblPrEx>
-          <w:tblCellMar>
-            <w:top w:w="0" w:type="dxa"/>
-            <w:bottom w:w="0" w:type="dxa"/>
-          </w:tblCellMar>
-        </w:tblPrEx>
         <w:tc>
           <w:tcPr>
             <w:tcW w:w="2707" w:type="dxa"/>
@@ -1391,12 +1667,6 @@
         </w:tc>
       </w:tr>
       <w:tr>
-        <w:tblPrEx>
-          <w:tblCellMar>
-            <w:top w:w="0" w:type="dxa"/>
-            <w:bottom w:w="0" w:type="dxa"/>
-          </w:tblCellMar>
-        </w:tblPrEx>
         <w:tc>
           <w:tcPr>
             <w:tcW w:w="2707" w:type="dxa"/>
@@ -1445,12 +1715,6 @@
         </w:tc>
       </w:tr>
       <w:tr>
-        <w:tblPrEx>
-          <w:tblCellMar>
-            <w:top w:w="0" w:type="dxa"/>
-            <w:bottom w:w="0" w:type="dxa"/>
-          </w:tblCellMar>
-        </w:tblPrEx>
         <w:tc>
           <w:tcPr>
             <w:tcW w:w="2707" w:type="dxa"/>
@@ -1523,7 +1787,25 @@
         <w:pStyle w:val="Ttulo2"/>
       </w:pPr>
       <w:r>
-        <w:t>4.1   Diagrama de Casos de Uso  (use_cases.puml)</w:t>
+        <w:t xml:space="preserve">4.1   Diagrama de Casos de </w:t>
+      </w:r>
+      <w:proofErr w:type="gramStart"/>
+      <w:r>
+        <w:t>Uso  (</w:t>
+      </w:r>
+      <w:proofErr w:type="spellStart"/>
+      <w:proofErr w:type="gramEnd"/>
+      <w:r>
+        <w:t>use_</w:t>
+      </w:r>
+      <w:proofErr w:type="gramStart"/>
+      <w:r>
+        <w:t>cases.puml</w:t>
+      </w:r>
+      <w:proofErr w:type="spellEnd"/>
+      <w:proofErr w:type="gramEnd"/>
+      <w:r>
+        <w:t>)</w:t>
       </w:r>
     </w:p>
     <w:p>
@@ -1649,7 +1931,23 @@
         <w:spacing w:before="40" w:after="40"/>
       </w:pPr>
       <w:r>
-        <w:t>UC9  — Registar Participação  (inclui: Selecionar Piloto, Selecionar Corrida)</w:t>
+        <w:t>UC</w:t>
+      </w:r>
+      <w:proofErr w:type="gramStart"/>
+      <w:r>
+        <w:t>9  —</w:t>
+      </w:r>
+      <w:proofErr w:type="gramEnd"/>
+      <w:r>
+        <w:t xml:space="preserve"> Registar </w:t>
+      </w:r>
+      <w:proofErr w:type="gramStart"/>
+      <w:r>
+        <w:t>Participação  (</w:t>
+      </w:r>
+      <w:proofErr w:type="gramEnd"/>
+      <w:r>
+        <w:t>inclui: Selecionar Piloto, Selecionar Corrida)</w:t>
       </w:r>
     </w:p>
     <w:p>
@@ -1662,7 +1960,15 @@
         <w:spacing w:before="40" w:after="40"/>
       </w:pPr>
       <w:r>
-        <w:t>UC10 — Consultar Classificação  (inclui: Selecionar Corrida)</w:t>
+        <w:t xml:space="preserve">UC10 — Consultar </w:t>
+      </w:r>
+      <w:proofErr w:type="gramStart"/>
+      <w:r>
+        <w:t>Classificação  (</w:t>
+      </w:r>
+      <w:proofErr w:type="gramEnd"/>
+      <w:r>
+        <w:t>inclui: Selecionar Corrida)</w:t>
       </w:r>
     </w:p>
     <w:p>
@@ -1714,12 +2020,6 @@
         <w:gridCol w:w="6319"/>
       </w:tblGrid>
       <w:tr>
-        <w:tblPrEx>
-          <w:tblCellMar>
-            <w:top w:w="0" w:type="dxa"/>
-            <w:bottom w:w="0" w:type="dxa"/>
-          </w:tblCellMar>
-        </w:tblPrEx>
         <w:tc>
           <w:tcPr>
             <w:tcW w:w="2707" w:type="dxa"/>
@@ -1776,12 +2076,6 @@
         </w:tc>
       </w:tr>
       <w:tr>
-        <w:tblPrEx>
-          <w:tblCellMar>
-            <w:top w:w="0" w:type="dxa"/>
-            <w:bottom w:w="0" w:type="dxa"/>
-          </w:tblCellMar>
-        </w:tblPrEx>
         <w:tc>
           <w:tcPr>
             <w:tcW w:w="2707" w:type="dxa"/>
@@ -1830,12 +2124,6 @@
         </w:tc>
       </w:tr>
       <w:tr>
-        <w:tblPrEx>
-          <w:tblCellMar>
-            <w:top w:w="0" w:type="dxa"/>
-            <w:bottom w:w="0" w:type="dxa"/>
-          </w:tblCellMar>
-        </w:tblPrEx>
         <w:tc>
           <w:tcPr>
             <w:tcW w:w="2707" w:type="dxa"/>
@@ -1884,12 +2172,6 @@
         </w:tc>
       </w:tr>
       <w:tr>
-        <w:tblPrEx>
-          <w:tblCellMar>
-            <w:top w:w="0" w:type="dxa"/>
-            <w:bottom w:w="0" w:type="dxa"/>
-          </w:tblCellMar>
-        </w:tblPrEx>
         <w:tc>
           <w:tcPr>
             <w:tcW w:w="2707" w:type="dxa"/>
@@ -1938,12 +2220,6 @@
         </w:tc>
       </w:tr>
       <w:tr>
-        <w:tblPrEx>
-          <w:tblCellMar>
-            <w:top w:w="0" w:type="dxa"/>
-            <w:bottom w:w="0" w:type="dxa"/>
-          </w:tblCellMar>
-        </w:tblPrEx>
         <w:tc>
           <w:tcPr>
             <w:tcW w:w="2707" w:type="dxa"/>
@@ -1985,7 +2261,15 @@
           </w:tcPr>
           <w:p>
             <w:r>
-              <w:t>1. O Utilizador introduz os dados do piloto (nome, data de nasc., licença).</w:t>
+              <w:t xml:space="preserve">1. O Utilizador introduz os dados do piloto (nome, data de </w:t>
+            </w:r>
+            <w:proofErr w:type="spellStart"/>
+            <w:r>
+              <w:t>nasc</w:t>
+            </w:r>
+            <w:proofErr w:type="spellEnd"/>
+            <w:r>
+              <w:t>., licença).</w:t>
             </w:r>
           </w:p>
           <w:p>
@@ -2023,12 +2307,6 @@
         </w:tc>
       </w:tr>
       <w:tr>
-        <w:tblPrEx>
-          <w:tblCellMar>
-            <w:top w:w="0" w:type="dxa"/>
-            <w:bottom w:w="0" w:type="dxa"/>
-          </w:tblCellMar>
-        </w:tblPrEx>
         <w:tc>
           <w:tcPr>
             <w:tcW w:w="2707" w:type="dxa"/>
@@ -2130,12 +2408,6 @@
         <w:gridCol w:w="6319"/>
       </w:tblGrid>
       <w:tr>
-        <w:tblPrEx>
-          <w:tblCellMar>
-            <w:top w:w="0" w:type="dxa"/>
-            <w:bottom w:w="0" w:type="dxa"/>
-          </w:tblCellMar>
-        </w:tblPrEx>
         <w:tc>
           <w:tcPr>
             <w:tcW w:w="2707" w:type="dxa"/>
@@ -2192,12 +2464,6 @@
         </w:tc>
       </w:tr>
       <w:tr>
-        <w:tblPrEx>
-          <w:tblCellMar>
-            <w:top w:w="0" w:type="dxa"/>
-            <w:bottom w:w="0" w:type="dxa"/>
-          </w:tblCellMar>
-        </w:tblPrEx>
         <w:tc>
           <w:tcPr>
             <w:tcW w:w="2707" w:type="dxa"/>
@@ -2246,12 +2512,6 @@
         </w:tc>
       </w:tr>
       <w:tr>
-        <w:tblPrEx>
-          <w:tblCellMar>
-            <w:top w:w="0" w:type="dxa"/>
-            <w:bottom w:w="0" w:type="dxa"/>
-          </w:tblCellMar>
-        </w:tblPrEx>
         <w:tc>
           <w:tcPr>
             <w:tcW w:w="2707" w:type="dxa"/>
@@ -2300,12 +2560,6 @@
         </w:tc>
       </w:tr>
       <w:tr>
-        <w:tblPrEx>
-          <w:tblCellMar>
-            <w:top w:w="0" w:type="dxa"/>
-            <w:bottom w:w="0" w:type="dxa"/>
-          </w:tblCellMar>
-        </w:tblPrEx>
         <w:tc>
           <w:tcPr>
             <w:tcW w:w="2707" w:type="dxa"/>
@@ -2354,12 +2608,6 @@
         </w:tc>
       </w:tr>
       <w:tr>
-        <w:tblPrEx>
-          <w:tblCellMar>
-            <w:top w:w="0" w:type="dxa"/>
-            <w:bottom w:w="0" w:type="dxa"/>
-          </w:tblCellMar>
-        </w:tblPrEx>
         <w:tc>
           <w:tcPr>
             <w:tcW w:w="2707" w:type="dxa"/>
@@ -2463,12 +2711,6 @@
         </w:tc>
       </w:tr>
       <w:tr>
-        <w:tblPrEx>
-          <w:tblCellMar>
-            <w:top w:w="0" w:type="dxa"/>
-            <w:bottom w:w="0" w:type="dxa"/>
-          </w:tblCellMar>
-        </w:tblPrEx>
         <w:tc>
           <w:tcPr>
             <w:tcW w:w="2707" w:type="dxa"/>
@@ -2527,7 +2769,15 @@
       </w:pPr>
       <w:r>
         <w:lastRenderedPageBreak/>
-        <w:t>4.4   Diagramas de Sequência do Sistema (SSDs)</w:t>
+        <w:t>4.4   Diagramas de Sequência do Sistema (</w:t>
+      </w:r>
+      <w:proofErr w:type="spellStart"/>
+      <w:r>
+        <w:t>SSDs</w:t>
+      </w:r>
+      <w:proofErr w:type="spellEnd"/>
+      <w:r>
+        <w:t>)</w:t>
       </w:r>
     </w:p>
     <w:p>
@@ -2536,7 +2786,31 @@
         <w:jc w:val="both"/>
       </w:pPr>
       <w:r>
-        <w:t>Para cada caso de uso relevante foi elaborado um diagrama SSD em PlantUML, todos localizados em Documentation/Iteration01/. Os três SSDs produzidos são:</w:t>
+        <w:t xml:space="preserve">Para cada caso de uso relevante foi elaborado um diagrama SSD em </w:t>
+      </w:r>
+      <w:proofErr w:type="spellStart"/>
+      <w:r>
+        <w:t>PlantUML</w:t>
+      </w:r>
+      <w:proofErr w:type="spellEnd"/>
+      <w:r>
+        <w:t xml:space="preserve">, todos localizados em </w:t>
+      </w:r>
+      <w:proofErr w:type="spellStart"/>
+      <w:r>
+        <w:t>Documentation</w:t>
+      </w:r>
+      <w:proofErr w:type="spellEnd"/>
+      <w:r>
+        <w:t xml:space="preserve">/Iteration01/. Os três </w:t>
+      </w:r>
+      <w:proofErr w:type="spellStart"/>
+      <w:r>
+        <w:t>SSDs</w:t>
+      </w:r>
+      <w:proofErr w:type="spellEnd"/>
+      <w:r>
+        <w:t xml:space="preserve"> produzidos são:</w:t>
       </w:r>
     </w:p>
     <w:p>
@@ -2550,12 +2824,21 @@
         </w:rPr>
         <w:t xml:space="preserve">Tabela 5. </w:t>
       </w:r>
+      <w:proofErr w:type="spellStart"/>
       <w:r>
         <w:rPr>
           <w:i/>
           <w:iCs/>
         </w:rPr>
-        <w:t>SSDs produzidos na Iteração 01.</w:t>
+        <w:t>SSDs</w:t>
+      </w:r>
+      <w:proofErr w:type="spellEnd"/>
+      <w:r>
+        <w:rPr>
+          <w:i/>
+          <w:iCs/>
+        </w:rPr>
+        <w:t xml:space="preserve"> produzidos na Iteração 01.</w:t>
       </w:r>
     </w:p>
     <w:tbl>
@@ -2580,12 +2863,6 @@
         <w:gridCol w:w="6114"/>
       </w:tblGrid>
       <w:tr>
-        <w:tblPrEx>
-          <w:tblCellMar>
-            <w:top w:w="0" w:type="dxa"/>
-            <w:bottom w:w="0" w:type="dxa"/>
-          </w:tblCellMar>
-        </w:tblPrEx>
         <w:tc>
           <w:tcPr>
             <w:tcW w:w="2707" w:type="dxa"/>
@@ -2642,12 +2919,6 @@
         </w:tc>
       </w:tr>
       <w:tr>
-        <w:tblPrEx>
-          <w:tblCellMar>
-            <w:top w:w="0" w:type="dxa"/>
-            <w:bottom w:w="0" w:type="dxa"/>
-          </w:tblCellMar>
-        </w:tblPrEx>
         <w:tc>
           <w:tcPr>
             <w:tcW w:w="2707" w:type="dxa"/>
@@ -2666,9 +2937,16 @@
             </w:tcMar>
           </w:tcPr>
           <w:p>
-            <w:r>
-              <w:t>ssd_criar_piloto.puml</w:t>
-            </w:r>
+            <w:proofErr w:type="spellStart"/>
+            <w:r>
+              <w:t>ssd_criar_</w:t>
+            </w:r>
+            <w:proofErr w:type="gramStart"/>
+            <w:r>
+              <w:t>piloto.puml</w:t>
+            </w:r>
+            <w:proofErr w:type="spellEnd"/>
+            <w:proofErr w:type="gramEnd"/>
           </w:p>
         </w:tc>
         <w:tc>
@@ -2690,18 +2968,20 @@
           </w:tcPr>
           <w:p>
             <w:r>
-              <w:t>UC1 — Criar Piloto: entrar dados, validar e armazenar, com bloco alt para dados inválidos.</w:t>
+              <w:t xml:space="preserve">UC1 — Criar Piloto: entrar dados, validar e armazenar, com bloco </w:t>
+            </w:r>
+            <w:proofErr w:type="spellStart"/>
+            <w:r>
+              <w:t>alt</w:t>
+            </w:r>
+            <w:proofErr w:type="spellEnd"/>
+            <w:r>
+              <w:t xml:space="preserve"> para dados inválidos.</w:t>
             </w:r>
           </w:p>
         </w:tc>
       </w:tr>
       <w:tr>
-        <w:tblPrEx>
-          <w:tblCellMar>
-            <w:top w:w="0" w:type="dxa"/>
-            <w:bottom w:w="0" w:type="dxa"/>
-          </w:tblCellMar>
-        </w:tblPrEx>
         <w:tc>
           <w:tcPr>
             <w:tcW w:w="2707" w:type="dxa"/>
@@ -2720,9 +3000,16 @@
             </w:tcMar>
           </w:tcPr>
           <w:p>
-            <w:r>
-              <w:t>ssd_registar_participacao.puml</w:t>
-            </w:r>
+            <w:proofErr w:type="spellStart"/>
+            <w:r>
+              <w:t>ssd_registar_</w:t>
+            </w:r>
+            <w:proofErr w:type="gramStart"/>
+            <w:r>
+              <w:t>participacao.puml</w:t>
+            </w:r>
+            <w:proofErr w:type="spellEnd"/>
+            <w:proofErr w:type="gramEnd"/>
           </w:p>
         </w:tc>
         <w:tc>
@@ -2744,18 +3031,20 @@
           </w:tcPr>
           <w:p>
             <w:r>
-              <w:t>UC9 — Registar Participação: seleccionar piloto e corrida, introduzir resultados, validar e guardar.</w:t>
+              <w:t xml:space="preserve">UC9 — Registar Participação: </w:t>
+            </w:r>
+            <w:proofErr w:type="spellStart"/>
+            <w:r>
+              <w:t>seleccionar</w:t>
+            </w:r>
+            <w:proofErr w:type="spellEnd"/>
+            <w:r>
+              <w:t xml:space="preserve"> piloto e corrida, introduzir resultados, validar e guardar.</w:t>
             </w:r>
           </w:p>
         </w:tc>
       </w:tr>
       <w:tr>
-        <w:tblPrEx>
-          <w:tblCellMar>
-            <w:top w:w="0" w:type="dxa"/>
-            <w:bottom w:w="0" w:type="dxa"/>
-          </w:tblCellMar>
-        </w:tblPrEx>
         <w:tc>
           <w:tcPr>
             <w:tcW w:w="2707" w:type="dxa"/>
@@ -2774,9 +3063,16 @@
             </w:tcMar>
           </w:tcPr>
           <w:p>
-            <w:r>
-              <w:t>ssd_consultar_classificacao.puml</w:t>
-            </w:r>
+            <w:proofErr w:type="spellStart"/>
+            <w:r>
+              <w:t>ssd_consultar_</w:t>
+            </w:r>
+            <w:proofErr w:type="gramStart"/>
+            <w:r>
+              <w:t>classificacao.puml</w:t>
+            </w:r>
+            <w:proofErr w:type="spellEnd"/>
+            <w:proofErr w:type="gramEnd"/>
           </w:p>
         </w:tc>
         <w:tc>
@@ -2798,7 +3094,15 @@
           </w:tcPr>
           <w:p>
             <w:r>
-              <w:t>UC10 — Consultar Classificação: seleccionar corrida, obter e ordenar participações.</w:t>
+              <w:t xml:space="preserve">UC10 — Consultar Classificação: </w:t>
+            </w:r>
+            <w:proofErr w:type="spellStart"/>
+            <w:r>
+              <w:t>seleccionar</w:t>
+            </w:r>
+            <w:proofErr w:type="spellEnd"/>
+            <w:r>
+              <w:t xml:space="preserve"> corrida, obter e ordenar participações.</w:t>
             </w:r>
           </w:p>
         </w:tc>
@@ -2823,7 +3127,25 @@
         <w:pStyle w:val="Ttulo2"/>
       </w:pPr>
       <w:r>
-        <w:t>5.1   Organização em Camadas  (class_diagram.puml)</w:t>
+        <w:t xml:space="preserve">5.1   Organização em </w:t>
+      </w:r>
+      <w:proofErr w:type="gramStart"/>
+      <w:r>
+        <w:t>Camadas  (</w:t>
+      </w:r>
+      <w:proofErr w:type="spellStart"/>
+      <w:proofErr w:type="gramEnd"/>
+      <w:r>
+        <w:t>class_</w:t>
+      </w:r>
+      <w:proofErr w:type="gramStart"/>
+      <w:r>
+        <w:t>diagram.puml</w:t>
+      </w:r>
+      <w:proofErr w:type="spellEnd"/>
+      <w:proofErr w:type="gramEnd"/>
+      <w:r>
+        <w:t>)</w:t>
       </w:r>
     </w:p>
     <w:p>
@@ -2856,7 +3178,20 @@
         <w:t>refletida</w:t>
       </w:r>
       <w:r>
-        <w:t xml:space="preserve"> no diagrama de classes (class_diagram.puml):</w:t>
+        <w:t xml:space="preserve"> no diagrama de classes (</w:t>
+      </w:r>
+      <w:proofErr w:type="spellStart"/>
+      <w:r>
+        <w:t>class_</w:t>
+      </w:r>
+      <w:proofErr w:type="gramStart"/>
+      <w:r>
+        <w:t>diagram.puml</w:t>
+      </w:r>
+      <w:proofErr w:type="spellEnd"/>
+      <w:proofErr w:type="gramEnd"/>
+      <w:r>
+        <w:t>):</w:t>
       </w:r>
     </w:p>
     <w:p>
@@ -2868,8 +3203,13 @@
         </w:numPr>
         <w:spacing w:before="40" w:after="40"/>
       </w:pPr>
-      <w:r>
-        <w:t>Model — classes de dados puras: Piloto, Equipa, Veículo, Corrida, Participação.</w:t>
+      <w:proofErr w:type="spellStart"/>
+      <w:r>
+        <w:t>Model</w:t>
+      </w:r>
+      <w:proofErr w:type="spellEnd"/>
+      <w:r>
+        <w:t xml:space="preserve"> — classes de dados puras: Piloto, Equipa, Veículo, Corrida, Participação.</w:t>
       </w:r>
     </w:p>
     <w:p>
@@ -2881,8 +3221,21 @@
         </w:numPr>
         <w:spacing w:before="40" w:after="40"/>
       </w:pPr>
-      <w:r>
-        <w:t>Store — classes de persistência em ficheiros binários (*Store.h / *Store.cpp).</w:t>
+      <w:proofErr w:type="spellStart"/>
+      <w:r>
+        <w:t>Store</w:t>
+      </w:r>
+      <w:proofErr w:type="spellEnd"/>
+      <w:r>
+        <w:t xml:space="preserve"> — classes de persistência em ficheiros binários (*</w:t>
+      </w:r>
+      <w:proofErr w:type="spellStart"/>
+      <w:r>
+        <w:t>Store.h</w:t>
+      </w:r>
+      <w:proofErr w:type="spellEnd"/>
+      <w:r>
+        <w:t xml:space="preserve"> / *Store.cpp).</w:t>
       </w:r>
     </w:p>
     <w:p>
@@ -2894,8 +3247,21 @@
         </w:numPr>
         <w:spacing w:before="40" w:after="40"/>
       </w:pPr>
-      <w:r>
-        <w:t>Controller — classes com a lógica de negócio e validação (*Controller.h / *Controller.cpp).</w:t>
+      <w:proofErr w:type="spellStart"/>
+      <w:r>
+        <w:t>Controller</w:t>
+      </w:r>
+      <w:proofErr w:type="spellEnd"/>
+      <w:r>
+        <w:t xml:space="preserve"> — classes com a lógica de negócio e validação (*</w:t>
+      </w:r>
+      <w:proofErr w:type="spellStart"/>
+      <w:r>
+        <w:t>Controller.h</w:t>
+      </w:r>
+      <w:proofErr w:type="spellEnd"/>
+      <w:r>
+        <w:t xml:space="preserve"> / *Controller.cpp).</w:t>
       </w:r>
     </w:p>
     <w:p>
@@ -2914,7 +3280,15 @@
         <w:t>interação</w:t>
       </w:r>
       <w:r>
-        <w:t xml:space="preserve"> com o utilizador via consola (*UI.h / *UI.cpp) e a classe Menu.</w:t>
+        <w:t xml:space="preserve"> com o utilizador via consola (*</w:t>
+      </w:r>
+      <w:proofErr w:type="spellStart"/>
+      <w:r>
+        <w:t>UI.h</w:t>
+      </w:r>
+      <w:proofErr w:type="spellEnd"/>
+      <w:r>
+        <w:t xml:space="preserve"> / *UI.cpp) e a classe Menu.</w:t>
       </w:r>
     </w:p>
     <w:p>
@@ -2923,7 +3297,31 @@
         <w:jc w:val="both"/>
       </w:pPr>
       <w:r>
-        <w:t>As dependências seguem sempre o sentido UI → Controller → Store → Model, garantindo a separação de responsabilidades e facilitando os testes unitários a implementar na pasta ProjectTester.</w:t>
+        <w:t xml:space="preserve">As dependências seguem sempre o sentido UI → </w:t>
+      </w:r>
+      <w:proofErr w:type="spellStart"/>
+      <w:r>
+        <w:t>Controller</w:t>
+      </w:r>
+      <w:proofErr w:type="spellEnd"/>
+      <w:r>
+        <w:t xml:space="preserve"> → </w:t>
+      </w:r>
+      <w:proofErr w:type="spellStart"/>
+      <w:r>
+        <w:t>Store</w:t>
+      </w:r>
+      <w:proofErr w:type="spellEnd"/>
+      <w:r>
+        <w:t xml:space="preserve"> → </w:t>
+      </w:r>
+      <w:proofErr w:type="spellStart"/>
+      <w:r>
+        <w:t>Model</w:t>
+      </w:r>
+      <w:proofErr w:type="spellEnd"/>
+      <w:r>
+        <w:t>, garantindo a separação de responsabilidades e facilitando os testes unitários a implementar na pasta ProjectTester.</w:t>
       </w:r>
     </w:p>
     <w:p>
@@ -2931,7 +3329,25 @@
         <w:pStyle w:val="Ttulo2"/>
       </w:pPr>
       <w:r>
-        <w:t>5.2   Estrutura de Pacotes  (package_diagram.puml)</w:t>
+        <w:t xml:space="preserve">5.2   Estrutura de </w:t>
+      </w:r>
+      <w:proofErr w:type="gramStart"/>
+      <w:r>
+        <w:t>Pacotes  (</w:t>
+      </w:r>
+      <w:proofErr w:type="spellStart"/>
+      <w:proofErr w:type="gramEnd"/>
+      <w:r>
+        <w:t>package_</w:t>
+      </w:r>
+      <w:proofErr w:type="gramStart"/>
+      <w:r>
+        <w:t>diagram.puml</w:t>
+      </w:r>
+      <w:proofErr w:type="spellEnd"/>
+      <w:proofErr w:type="gramEnd"/>
+      <w:r>
+        <w:t>)</w:t>
       </w:r>
     </w:p>
     <w:p>
@@ -2940,7 +3356,28 @@
         <w:jc w:val="both"/>
       </w:pPr>
       <w:r>
-        <w:t>O diagrama de pacotes (package_diagram.puml) complementa o diagrama de classes ao mostrar a organização física dos ficheiros fonte dentro da pasta Project, as dependências entre pacotes e os ficheiros de dados binários gerados em runtime na pasta data/.</w:t>
+        <w:t>O diagrama de pacotes (</w:t>
+      </w:r>
+      <w:proofErr w:type="spellStart"/>
+      <w:r>
+        <w:t>package_</w:t>
+      </w:r>
+      <w:proofErr w:type="gramStart"/>
+      <w:r>
+        <w:t>diagram.puml</w:t>
+      </w:r>
+      <w:proofErr w:type="spellEnd"/>
+      <w:proofErr w:type="gramEnd"/>
+      <w:r>
+        <w:t xml:space="preserve">) complementa o diagrama de classes ao mostrar a organização física dos ficheiros fonte dentro da pasta Project, as dependências entre pacotes e os ficheiros de dados binários gerados em </w:t>
+      </w:r>
+      <w:proofErr w:type="spellStart"/>
+      <w:r>
+        <w:t>runtime</w:t>
+      </w:r>
+      <w:proofErr w:type="spellEnd"/>
+      <w:r>
+        <w:t xml:space="preserve"> na pasta data/.</w:t>
       </w:r>
     </w:p>
     <w:p>
@@ -2984,12 +3421,6 @@
         <w:gridCol w:w="6319"/>
       </w:tblGrid>
       <w:tr>
-        <w:tblPrEx>
-          <w:tblCellMar>
-            <w:top w:w="0" w:type="dxa"/>
-            <w:bottom w:w="0" w:type="dxa"/>
-          </w:tblCellMar>
-        </w:tblPrEx>
         <w:tc>
           <w:tcPr>
             <w:tcW w:w="2707" w:type="dxa"/>
@@ -3046,12 +3477,6 @@
         </w:tc>
       </w:tr>
       <w:tr>
-        <w:tblPrEx>
-          <w:tblCellMar>
-            <w:top w:w="0" w:type="dxa"/>
-            <w:bottom w:w="0" w:type="dxa"/>
-          </w:tblCellMar>
-        </w:tblPrEx>
         <w:tc>
           <w:tcPr>
             <w:tcW w:w="2707" w:type="dxa"/>
@@ -3070,8 +3495,13 @@
             </w:tcMar>
           </w:tcPr>
           <w:p>
-            <w:r>
-              <w:t>model/</w:t>
+            <w:proofErr w:type="spellStart"/>
+            <w:r>
+              <w:t>model</w:t>
+            </w:r>
+            <w:proofErr w:type="spellEnd"/>
+            <w:r>
+              <w:t>/</w:t>
             </w:r>
           </w:p>
         </w:tc>
@@ -3094,18 +3524,36 @@
           </w:tcPr>
           <w:p>
             <w:r>
-              <w:t>Piloto, Equipa, Veiculo, Corrida, Participacao (.h / .cpp)</w:t>
+              <w:t xml:space="preserve">Piloto, Equipa, </w:t>
+            </w:r>
+            <w:proofErr w:type="gramStart"/>
+            <w:r>
+              <w:t>Veiculo</w:t>
+            </w:r>
+            <w:proofErr w:type="gramEnd"/>
+            <w:r>
+              <w:t xml:space="preserve">, Corrida, </w:t>
+            </w:r>
+            <w:proofErr w:type="spellStart"/>
+            <w:r>
+              <w:t>Participacao</w:t>
+            </w:r>
+            <w:proofErr w:type="spellEnd"/>
+            <w:r>
+              <w:t xml:space="preserve"> (.h / .</w:t>
+            </w:r>
+            <w:proofErr w:type="spellStart"/>
+            <w:r>
+              <w:t>cpp</w:t>
+            </w:r>
+            <w:proofErr w:type="spellEnd"/>
+            <w:r>
+              <w:t>)</w:t>
             </w:r>
           </w:p>
         </w:tc>
       </w:tr>
       <w:tr>
-        <w:tblPrEx>
-          <w:tblCellMar>
-            <w:top w:w="0" w:type="dxa"/>
-            <w:bottom w:w="0" w:type="dxa"/>
-          </w:tblCellMar>
-        </w:tblPrEx>
         <w:tc>
           <w:tcPr>
             <w:tcW w:w="2707" w:type="dxa"/>
@@ -3124,8 +3572,13 @@
             </w:tcMar>
           </w:tcPr>
           <w:p>
-            <w:r>
-              <w:t>controller/</w:t>
+            <w:proofErr w:type="spellStart"/>
+            <w:r>
+              <w:t>controller</w:t>
+            </w:r>
+            <w:proofErr w:type="spellEnd"/>
+            <w:r>
+              <w:t>/</w:t>
             </w:r>
           </w:p>
         </w:tc>
@@ -3147,19 +3600,58 @@
             </w:tcMar>
           </w:tcPr>
           <w:p>
-            <w:r>
-              <w:t>PilotoController, EquipaController, VeiculoController, CorridaController, ParticipacaoController (.h / .cpp)</w:t>
+            <w:proofErr w:type="spellStart"/>
+            <w:r>
+              <w:t>PilotoController</w:t>
+            </w:r>
+            <w:proofErr w:type="spellEnd"/>
+            <w:r>
+              <w:t xml:space="preserve">, </w:t>
+            </w:r>
+            <w:proofErr w:type="spellStart"/>
+            <w:r>
+              <w:t>EquipaController</w:t>
+            </w:r>
+            <w:proofErr w:type="spellEnd"/>
+            <w:r>
+              <w:t xml:space="preserve">, </w:t>
+            </w:r>
+            <w:proofErr w:type="spellStart"/>
+            <w:r>
+              <w:t>VeiculoController</w:t>
+            </w:r>
+            <w:proofErr w:type="spellEnd"/>
+            <w:r>
+              <w:t xml:space="preserve">, </w:t>
+            </w:r>
+            <w:proofErr w:type="spellStart"/>
+            <w:r>
+              <w:t>CorridaController</w:t>
+            </w:r>
+            <w:proofErr w:type="spellEnd"/>
+            <w:r>
+              <w:t xml:space="preserve">, </w:t>
+            </w:r>
+            <w:proofErr w:type="spellStart"/>
+            <w:r>
+              <w:t>ParticipacaoController</w:t>
+            </w:r>
+            <w:proofErr w:type="spellEnd"/>
+            <w:r>
+              <w:t xml:space="preserve"> (.h / .</w:t>
+            </w:r>
+            <w:proofErr w:type="spellStart"/>
+            <w:r>
+              <w:t>cpp</w:t>
+            </w:r>
+            <w:proofErr w:type="spellEnd"/>
+            <w:r>
+              <w:t>)</w:t>
             </w:r>
           </w:p>
         </w:tc>
       </w:tr>
       <w:tr>
-        <w:tblPrEx>
-          <w:tblCellMar>
-            <w:top w:w="0" w:type="dxa"/>
-            <w:bottom w:w="0" w:type="dxa"/>
-          </w:tblCellMar>
-        </w:tblPrEx>
         <w:tc>
           <w:tcPr>
             <w:tcW w:w="2707" w:type="dxa"/>
@@ -3178,8 +3670,13 @@
             </w:tcMar>
           </w:tcPr>
           <w:p>
-            <w:r>
-              <w:t>store/</w:t>
+            <w:proofErr w:type="spellStart"/>
+            <w:r>
+              <w:t>store</w:t>
+            </w:r>
+            <w:proofErr w:type="spellEnd"/>
+            <w:r>
+              <w:t>/</w:t>
             </w:r>
           </w:p>
         </w:tc>
@@ -3201,19 +3698,58 @@
             </w:tcMar>
           </w:tcPr>
           <w:p>
-            <w:r>
-              <w:t>PilotoStore, EquipaStore, VeiculoStore, CorridaStore, ParticipacaoStore (.h / .cpp)</w:t>
+            <w:proofErr w:type="spellStart"/>
+            <w:r>
+              <w:t>PilotoStore</w:t>
+            </w:r>
+            <w:proofErr w:type="spellEnd"/>
+            <w:r>
+              <w:t xml:space="preserve">, </w:t>
+            </w:r>
+            <w:proofErr w:type="spellStart"/>
+            <w:r>
+              <w:t>EquipaStore</w:t>
+            </w:r>
+            <w:proofErr w:type="spellEnd"/>
+            <w:r>
+              <w:t xml:space="preserve">, </w:t>
+            </w:r>
+            <w:proofErr w:type="spellStart"/>
+            <w:r>
+              <w:t>VeiculoStore</w:t>
+            </w:r>
+            <w:proofErr w:type="spellEnd"/>
+            <w:r>
+              <w:t xml:space="preserve">, </w:t>
+            </w:r>
+            <w:proofErr w:type="spellStart"/>
+            <w:r>
+              <w:t>CorridaStore</w:t>
+            </w:r>
+            <w:proofErr w:type="spellEnd"/>
+            <w:r>
+              <w:t xml:space="preserve">, </w:t>
+            </w:r>
+            <w:proofErr w:type="spellStart"/>
+            <w:r>
+              <w:t>ParticipacaoStore</w:t>
+            </w:r>
+            <w:proofErr w:type="spellEnd"/>
+            <w:r>
+              <w:t xml:space="preserve"> (.h / .</w:t>
+            </w:r>
+            <w:proofErr w:type="spellStart"/>
+            <w:r>
+              <w:t>cpp</w:t>
+            </w:r>
+            <w:proofErr w:type="spellEnd"/>
+            <w:r>
+              <w:t>)</w:t>
             </w:r>
           </w:p>
         </w:tc>
       </w:tr>
       <w:tr>
-        <w:tblPrEx>
-          <w:tblCellMar>
-            <w:top w:w="0" w:type="dxa"/>
-            <w:bottom w:w="0" w:type="dxa"/>
-          </w:tblCellMar>
-        </w:tblPrEx>
         <w:tc>
           <w:tcPr>
             <w:tcW w:w="2707" w:type="dxa"/>
@@ -3256,18 +3792,60 @@
           </w:tcPr>
           <w:p>
             <w:r>
-              <w:t>Menu, PilotoUI, EquipaUI, VeiculoUI, CorridaUI, ParticipacaoUI (.h / .cpp)</w:t>
+              <w:t xml:space="preserve">Menu, </w:t>
+            </w:r>
+            <w:proofErr w:type="spellStart"/>
+            <w:r>
+              <w:t>PilotoUI</w:t>
+            </w:r>
+            <w:proofErr w:type="spellEnd"/>
+            <w:r>
+              <w:t xml:space="preserve">, </w:t>
+            </w:r>
+            <w:proofErr w:type="spellStart"/>
+            <w:r>
+              <w:t>EquipaUI</w:t>
+            </w:r>
+            <w:proofErr w:type="spellEnd"/>
+            <w:r>
+              <w:t xml:space="preserve">, </w:t>
+            </w:r>
+            <w:proofErr w:type="spellStart"/>
+            <w:r>
+              <w:t>VeiculoUI</w:t>
+            </w:r>
+            <w:proofErr w:type="spellEnd"/>
+            <w:r>
+              <w:t xml:space="preserve">, </w:t>
+            </w:r>
+            <w:proofErr w:type="spellStart"/>
+            <w:r>
+              <w:t>CorridaUI</w:t>
+            </w:r>
+            <w:proofErr w:type="spellEnd"/>
+            <w:r>
+              <w:t xml:space="preserve">, </w:t>
+            </w:r>
+            <w:proofErr w:type="spellStart"/>
+            <w:r>
+              <w:t>ParticipacaoUI</w:t>
+            </w:r>
+            <w:proofErr w:type="spellEnd"/>
+            <w:r>
+              <w:t xml:space="preserve"> (.h / .</w:t>
+            </w:r>
+            <w:proofErr w:type="spellStart"/>
+            <w:r>
+              <w:t>cpp</w:t>
+            </w:r>
+            <w:proofErr w:type="spellEnd"/>
+            <w:r>
+              <w:t>)</w:t>
             </w:r>
           </w:p>
         </w:tc>
       </w:tr>
       <w:tr>
-        <w:tblPrEx>
-          <w:tblCellMar>
-            <w:top w:w="0" w:type="dxa"/>
-            <w:bottom w:w="0" w:type="dxa"/>
-          </w:tblCellMar>
-        </w:tblPrEx>
         <w:tc>
           <w:tcPr>
             <w:tcW w:w="2707" w:type="dxa"/>
@@ -3310,7 +3888,31 @@
           </w:tcPr>
           <w:p>
             <w:r>
-              <w:t>Ficheiros binários gerados em runtime (pilotos.bin, equipas.bin, etc.)</w:t>
+              <w:t xml:space="preserve">Ficheiros binários gerados em </w:t>
+            </w:r>
+            <w:proofErr w:type="spellStart"/>
+            <w:r>
+              <w:t>runtime</w:t>
+            </w:r>
+            <w:proofErr w:type="spellEnd"/>
+            <w:r>
+              <w:t xml:space="preserve"> (</w:t>
+            </w:r>
+            <w:proofErr w:type="spellStart"/>
+            <w:r>
+              <w:t>pilotos.bin</w:t>
+            </w:r>
+            <w:proofErr w:type="spellEnd"/>
+            <w:r>
+              <w:t xml:space="preserve">, </w:t>
+            </w:r>
+            <w:proofErr w:type="spellStart"/>
+            <w:r>
+              <w:t>equipas.bin</w:t>
+            </w:r>
+            <w:proofErr w:type="spellEnd"/>
+            <w:r>
+              <w:t>, etc.)</w:t>
             </w:r>
           </w:p>
         </w:tc>
@@ -3344,31 +3946,53 @@
       </w:r>
       <w:r>
         <w:tab/>
-        <w:t>Sousa, P.B., Freitas, C.: Requirements Engineering/Analysis — FSOFT TP Week 4. ISEP, Porto (2025).</w:t>
-      </w:r>
-    </w:p>
-    <w:p>
-      <w:pPr>
-        <w:spacing w:before="40" w:after="60"/>
-      </w:pPr>
-      <w:r>
-        <w:t>2.</w:t>
-      </w:r>
-      <w:r>
-        <w:tab/>
-        <w:t>Rumbaugh, J., Jacobson, I., Booch, G.: The Unified Modeling Language Reference Manual, 2nd edn. Addison-Wesley, Boston (2004).</w:t>
-      </w:r>
-    </w:p>
-    <w:p>
-      <w:pPr>
-        <w:spacing w:before="40" w:after="60"/>
-      </w:pPr>
-      <w:r>
-        <w:t>3.</w:t>
-      </w:r>
-      <w:r>
-        <w:tab/>
-        <w:t>Larman, C.: Applying UML and Patterns, 3rd edn. Prentice Hall, Upper Saddle River (2004).</w:t>
+      </w:r>
+      <w:r>
+        <w:t>Paulo Baltarejo Sousa</w:t>
+      </w:r>
+      <w:r>
+        <w:t xml:space="preserve">, </w:t>
+      </w:r>
+      <w:r>
+        <w:t xml:space="preserve">Carlos </w:t>
+      </w:r>
+      <w:r>
+        <w:t>Freitas</w:t>
+      </w:r>
+      <w:r>
+        <w:t xml:space="preserve">: </w:t>
+      </w:r>
+      <w:proofErr w:type="spellStart"/>
+      <w:r>
+        <w:t>Requirements</w:t>
+      </w:r>
+      <w:proofErr w:type="spellEnd"/>
+      <w:r>
+        <w:t xml:space="preserve"> </w:t>
+      </w:r>
+      <w:proofErr w:type="spellStart"/>
+      <w:r>
+        <w:t>Engineering</w:t>
+      </w:r>
+      <w:proofErr w:type="spellEnd"/>
+      <w:r>
+        <w:t>/</w:t>
+      </w:r>
+      <w:proofErr w:type="spellStart"/>
+      <w:r>
+        <w:t>Analysis</w:t>
+      </w:r>
+      <w:proofErr w:type="spellEnd"/>
+      <w:r>
+        <w:t xml:space="preserve"> — FSOFT TP </w:t>
+      </w:r>
+      <w:proofErr w:type="spellStart"/>
+      <w:r>
+        <w:t>Week</w:t>
+      </w:r>
+      <w:proofErr w:type="spellEnd"/>
+      <w:r>
+        <w:t xml:space="preserve"> 4. ISEP, Porto (2025).</w:t>
       </w:r>
     </w:p>
     <w:sectPr>
@@ -4081,7 +4705,6 @@
   <w:style w:type="character" w:default="1" w:styleId="Tipodeletrapredefinidodopargrafo">
     <w:name w:val="Default Paragraph Font"/>
     <w:uiPriority w:val="1"/>
-    <w:semiHidden/>
     <w:unhideWhenUsed/>
   </w:style>
   <w:style w:type="table" w:default="1" w:styleId="Tabelanormal">
@@ -4505,4 +5128,213 @@
     </a:ext>
   </a:extLst>
 </a:theme>
+</file>
+
+<file path=customXml/item1.xml><?xml version="1.0" encoding="utf-8"?>
+<ct:contentTypeSchema xmlns:ct="http://schemas.microsoft.com/office/2006/metadata/contentType" xmlns:ma="http://schemas.microsoft.com/office/2006/metadata/properties/metaAttributes" ct:_="" ma:_="" ma:contentTypeName="Document" ma:contentTypeID="0x01010084FBBC41F098C44BA41DB754347C7BC3" ma:contentTypeVersion="6" ma:contentTypeDescription="Create a new document." ma:contentTypeScope="" ma:versionID="192c9ba2479eb5323960d55e1076841e">
+  <xsd:schema xmlns:xsd="http://www.w3.org/2001/XMLSchema" xmlns:xs="http://www.w3.org/2001/XMLSchema" xmlns:p="http://schemas.microsoft.com/office/2006/metadata/properties" xmlns:ns3="0dcc1a40-ea0e-47d8-a039-1dac49932a50" targetNamespace="http://schemas.microsoft.com/office/2006/metadata/properties" ma:root="true" ma:fieldsID="538bd0c5fa219a5e681903271b05c9bc" ns3:_="">
+    <xsd:import namespace="0dcc1a40-ea0e-47d8-a039-1dac49932a50"/>
+    <xsd:element name="properties">
+      <xsd:complexType>
+        <xsd:sequence>
+          <xsd:element name="documentManagement">
+            <xsd:complexType>
+              <xsd:all>
+                <xsd:element ref="ns3:MediaServiceDateTaken" minOccurs="0"/>
+                <xsd:element ref="ns3:_activity" minOccurs="0"/>
+                <xsd:element ref="ns3:MediaServiceMetadata" minOccurs="0"/>
+                <xsd:element ref="ns3:MediaServiceFastMetadata" minOccurs="0"/>
+                <xsd:element ref="ns3:MediaServiceSearchProperties" minOccurs="0"/>
+                <xsd:element ref="ns3:MediaServiceObjectDetectorVersions" minOccurs="0"/>
+              </xsd:all>
+            </xsd:complexType>
+          </xsd:element>
+        </xsd:sequence>
+      </xsd:complexType>
+    </xsd:element>
+  </xsd:schema>
+  <xsd:schema xmlns:xsd="http://www.w3.org/2001/XMLSchema" xmlns:xs="http://www.w3.org/2001/XMLSchema" xmlns:dms="http://schemas.microsoft.com/office/2006/documentManagement/types" xmlns:pc="http://schemas.microsoft.com/office/infopath/2007/PartnerControls" targetNamespace="0dcc1a40-ea0e-47d8-a039-1dac49932a50" elementFormDefault="qualified">
+    <xsd:import namespace="http://schemas.microsoft.com/office/2006/documentManagement/types"/>
+    <xsd:import namespace="http://schemas.microsoft.com/office/infopath/2007/PartnerControls"/>
+    <xsd:element name="MediaServiceDateTaken" ma:index="8" nillable="true" ma:displayName="MediaServiceDateTaken" ma:hidden="true" ma:indexed="true" ma:internalName="MediaServiceDateTaken" ma:readOnly="true">
+      <xsd:simpleType>
+        <xsd:restriction base="dms:Text"/>
+      </xsd:simpleType>
+    </xsd:element>
+    <xsd:element name="_activity" ma:index="9" nillable="true" ma:displayName="_activity" ma:hidden="true" ma:internalName="_activity">
+      <xsd:simpleType>
+        <xsd:restriction base="dms:Note"/>
+      </xsd:simpleType>
+    </xsd:element>
+    <xsd:element name="MediaServiceMetadata" ma:index="10" nillable="true" ma:displayName="MediaServiceMetadata" ma:hidden="true" ma:internalName="MediaServiceMetadata" ma:readOnly="true">
+      <xsd:simpleType>
+        <xsd:restriction base="dms:Note"/>
+      </xsd:simpleType>
+    </xsd:element>
+    <xsd:element name="MediaServiceFastMetadata" ma:index="11" nillable="true" ma:displayName="MediaServiceFastMetadata" ma:hidden="true" ma:internalName="MediaServiceFastMetadata" ma:readOnly="true">
+      <xsd:simpleType>
+        <xsd:restriction base="dms:Note"/>
+      </xsd:simpleType>
+    </xsd:element>
+    <xsd:element name="MediaServiceSearchProperties" ma:index="12" nillable="true" ma:displayName="MediaServiceSearchProperties" ma:hidden="true" ma:internalName="MediaServiceSearchProperties" ma:readOnly="true">
+      <xsd:simpleType>
+        <xsd:restriction base="dms:Note"/>
+      </xsd:simpleType>
+    </xsd:element>
+    <xsd:element name="MediaServiceObjectDetectorVersions" ma:index="13" nillable="true" ma:displayName="MediaServiceObjectDetectorVersions" ma:hidden="true" ma:indexed="true" ma:internalName="MediaServiceObjectDetectorVersions" ma:readOnly="true">
+      <xsd:simpleType>
+        <xsd:restriction base="dms:Text"/>
+      </xsd:simpleType>
+    </xsd:element>
+  </xsd:schema>
+  <xsd:schema xmlns="http://schemas.openxmlformats.org/package/2006/metadata/core-properties" xmlns:xsd="http://www.w3.org/2001/XMLSchema" xmlns:xsi="http://www.w3.org/2001/XMLSchema-instance" xmlns:dc="http://purl.org/dc/elements/1.1/" xmlns:dcterms="http://purl.org/dc/terms/" xmlns:odoc="http://schemas.microsoft.com/internal/obd" targetNamespace="http://schemas.openxmlformats.org/package/2006/metadata/core-properties" elementFormDefault="qualified" attributeFormDefault="unqualified" blockDefault="#all">
+    <xsd:import namespace="http://purl.org/dc/elements/1.1/" schemaLocation="http://dublincore.org/schemas/xmls/qdc/2003/04/02/dc.xsd"/>
+    <xsd:import namespace="http://purl.org/dc/terms/" schemaLocation="http://dublincore.org/schemas/xmls/qdc/2003/04/02/dcterms.xsd"/>
+    <xsd:element name="coreProperties" type="CT_coreProperties"/>
+    <xsd:complexType name="CT_coreProperties">
+      <xsd:all>
+        <xsd:element ref="dc:creator" minOccurs="0" maxOccurs="1"/>
+        <xsd:element ref="dcterms:created" minOccurs="0" maxOccurs="1"/>
+        <xsd:element ref="dc:identifier" minOccurs="0" maxOccurs="1"/>
+        <xsd:element name="contentType" minOccurs="0" maxOccurs="1" type="xsd:string" ma:index="0" ma:displayName="Content Type"/>
+        <xsd:element ref="dc:title" minOccurs="0" maxOccurs="1" ma:index="4" ma:displayName="Title"/>
+        <xsd:element ref="dc:subject" minOccurs="0" maxOccurs="1"/>
+        <xsd:element ref="dc:description" minOccurs="0" maxOccurs="1"/>
+        <xsd:element name="keywords" minOccurs="0" maxOccurs="1" type="xsd:string"/>
+        <xsd:element ref="dc:language" minOccurs="0" maxOccurs="1"/>
+        <xsd:element name="category" minOccurs="0" maxOccurs="1" type="xsd:string"/>
+        <xsd:element name="version" minOccurs="0" maxOccurs="1" type="xsd:string"/>
+        <xsd:element name="revision" minOccurs="0" maxOccurs="1" type="xsd:string">
+          <xsd:annotation>
+            <xsd:documentation>
+                        This value indicates the number of saves or revisions. The application is responsible for updating this value after each revision.
+                    </xsd:documentation>
+          </xsd:annotation>
+        </xsd:element>
+        <xsd:element name="lastModifiedBy" minOccurs="0" maxOccurs="1" type="xsd:string"/>
+        <xsd:element ref="dcterms:modified" minOccurs="0" maxOccurs="1"/>
+        <xsd:element name="contentStatus" minOccurs="0" maxOccurs="1" type="xsd:string"/>
+      </xsd:all>
+    </xsd:complexType>
+  </xsd:schema>
+  <xs:schema xmlns:pc="http://schemas.microsoft.com/office/infopath/2007/PartnerControls" xmlns:xs="http://www.w3.org/2001/XMLSchema" targetNamespace="http://schemas.microsoft.com/office/infopath/2007/PartnerControls" elementFormDefault="qualified" attributeFormDefault="unqualified">
+    <xs:element name="Person">
+      <xs:complexType>
+        <xs:sequence>
+          <xs:element ref="pc:DisplayName" minOccurs="0"/>
+          <xs:element ref="pc:AccountId" minOccurs="0"/>
+          <xs:element ref="pc:AccountType" minOccurs="0"/>
+        </xs:sequence>
+      </xs:complexType>
+    </xs:element>
+    <xs:element name="DisplayName" type="xs:string"/>
+    <xs:element name="AccountId" type="xs:string"/>
+    <xs:element name="AccountType" type="xs:string"/>
+    <xs:element name="BDCAssociatedEntity">
+      <xs:complexType>
+        <xs:sequence>
+          <xs:element ref="pc:BDCEntity" minOccurs="0" maxOccurs="unbounded"/>
+        </xs:sequence>
+        <xs:attribute ref="pc:EntityNamespace"/>
+        <xs:attribute ref="pc:EntityName"/>
+        <xs:attribute ref="pc:SystemInstanceName"/>
+        <xs:attribute ref="pc:AssociationName"/>
+      </xs:complexType>
+    </xs:element>
+    <xs:attribute name="EntityNamespace" type="xs:string"/>
+    <xs:attribute name="EntityName" type="xs:string"/>
+    <xs:attribute name="SystemInstanceName" type="xs:string"/>
+    <xs:attribute name="AssociationName" type="xs:string"/>
+    <xs:element name="BDCEntity">
+      <xs:complexType>
+        <xs:sequence>
+          <xs:element ref="pc:EntityDisplayName" minOccurs="0"/>
+          <xs:element ref="pc:EntityInstanceReference" minOccurs="0"/>
+          <xs:element ref="pc:EntityId1" minOccurs="0"/>
+          <xs:element ref="pc:EntityId2" minOccurs="0"/>
+          <xs:element ref="pc:EntityId3" minOccurs="0"/>
+          <xs:element ref="pc:EntityId4" minOccurs="0"/>
+          <xs:element ref="pc:EntityId5" minOccurs="0"/>
+        </xs:sequence>
+      </xs:complexType>
+    </xs:element>
+    <xs:element name="EntityDisplayName" type="xs:string"/>
+    <xs:element name="EntityInstanceReference" type="xs:string"/>
+    <xs:element name="EntityId1" type="xs:string"/>
+    <xs:element name="EntityId2" type="xs:string"/>
+    <xs:element name="EntityId3" type="xs:string"/>
+    <xs:element name="EntityId4" type="xs:string"/>
+    <xs:element name="EntityId5" type="xs:string"/>
+    <xs:element name="Terms">
+      <xs:complexType>
+        <xs:sequence>
+          <xs:element ref="pc:TermInfo" minOccurs="0" maxOccurs="unbounded"/>
+        </xs:sequence>
+      </xs:complexType>
+    </xs:element>
+    <xs:element name="TermInfo">
+      <xs:complexType>
+        <xs:sequence>
+          <xs:element ref="pc:TermName" minOccurs="0"/>
+          <xs:element ref="pc:TermId" minOccurs="0"/>
+        </xs:sequence>
+      </xs:complexType>
+    </xs:element>
+    <xs:element name="TermName" type="xs:string"/>
+    <xs:element name="TermId" type="xs:string"/>
+  </xs:schema>
+</ct:contentTypeSchema>
+</file>
+
+<file path=customXml/item2.xml><?xml version="1.0" encoding="utf-8"?>
+<?mso-contentType ?>
+<FormTemplates xmlns="http://schemas.microsoft.com/sharepoint/v3/contenttype/forms">
+  <Display>DocumentLibraryForm</Display>
+  <Edit>DocumentLibraryForm</Edit>
+  <New>DocumentLibraryForm</New>
+</FormTemplates>
+</file>
+
+<file path=customXml/item3.xml><?xml version="1.0" encoding="utf-8"?>
+<p:properties xmlns:p="http://schemas.microsoft.com/office/2006/metadata/properties" xmlns:xsi="http://www.w3.org/2001/XMLSchema-instance" xmlns:pc="http://schemas.microsoft.com/office/infopath/2007/PartnerControls">
+  <documentManagement>
+    <_activity xmlns="0dcc1a40-ea0e-47d8-a039-1dac49932a50" xsi:nil="true"/>
+  </documentManagement>
+</p:properties>
+</file>
+
+<file path=customXml/itemProps1.xml><?xml version="1.0" encoding="utf-8"?>
+<ds:datastoreItem xmlns:ds="http://schemas.openxmlformats.org/officeDocument/2006/customXml" ds:itemID="{F6ABFCA7-6E12-4013-8F34-339A8E91A759}">
+  <ds:schemaRefs>
+    <ds:schemaRef ds:uri="http://schemas.microsoft.com/office/2006/metadata/contentType"/>
+    <ds:schemaRef ds:uri="http://schemas.microsoft.com/office/2006/metadata/properties/metaAttributes"/>
+    <ds:schemaRef ds:uri="http://www.w3.org/2001/XMLSchema"/>
+    <ds:schemaRef ds:uri="http://schemas.microsoft.com/office/2006/metadata/properties"/>
+    <ds:schemaRef ds:uri="0dcc1a40-ea0e-47d8-a039-1dac49932a50"/>
+    <ds:schemaRef ds:uri="http://schemas.microsoft.com/office/2006/documentManagement/types"/>
+    <ds:schemaRef ds:uri="http://schemas.microsoft.com/office/infopath/2007/PartnerControls"/>
+    <ds:schemaRef ds:uri="http://schemas.openxmlformats.org/package/2006/metadata/core-properties"/>
+    <ds:schemaRef ds:uri="http://purl.org/dc/elements/1.1/"/>
+    <ds:schemaRef ds:uri="http://purl.org/dc/terms/"/>
+    <ds:schemaRef ds:uri="http://schemas.microsoft.com/internal/obd"/>
+  </ds:schemaRefs>
+</ds:datastoreItem>
+</file>
+
+<file path=customXml/itemProps2.xml><?xml version="1.0" encoding="utf-8"?>
+<ds:datastoreItem xmlns:ds="http://schemas.openxmlformats.org/officeDocument/2006/customXml" ds:itemID="{0CA7B765-6DF9-49EC-BD22-E21135EF939E}">
+  <ds:schemaRefs>
+    <ds:schemaRef ds:uri="http://schemas.microsoft.com/sharepoint/v3/contenttype/forms"/>
+  </ds:schemaRefs>
+</ds:datastoreItem>
+</file>
+
+<file path=customXml/itemProps3.xml><?xml version="1.0" encoding="utf-8"?>
+<ds:datastoreItem xmlns:ds="http://schemas.openxmlformats.org/officeDocument/2006/customXml" ds:itemID="{215D48A3-1F03-496E-8438-941A494C4533}">
+  <ds:schemaRefs>
+    <ds:schemaRef ds:uri="http://schemas.microsoft.com/office/2006/metadata/properties"/>
+    <ds:schemaRef ds:uri="http://schemas.microsoft.com/office/infopath/2007/PartnerControls"/>
+    <ds:schemaRef ds:uri="0dcc1a40-ea0e-47d8-a039-1dac49932a50"/>
+  </ds:schemaRefs>
+</ds:datastoreItem>
 </file>
</xml_diff>

<commit_message>
Small error correction on report
</commit_message>
<xml_diff>
--- a/Documentation/Iteration01/relatorio_gestao_pilotos_fsoft.docx
+++ b/Documentation/Iteration01/relatorio_gestao_pilotos_fsoft.docx
@@ -54,27 +54,7 @@
           <w:sz w:val="18"/>
           <w:szCs w:val="18"/>
         </w:rPr>
-        <w:t xml:space="preserve">LETI — Licenciatura em Engenharia de Telecomunicações e </w:t>
-      </w:r>
-      <w:proofErr w:type="gramStart"/>
-      <w:r>
-        <w:rPr>
-          <w:i/>
-          <w:iCs/>
-          <w:sz w:val="18"/>
-          <w:szCs w:val="18"/>
-        </w:rPr>
-        <w:t>Informática  |</w:t>
-      </w:r>
-      <w:proofErr w:type="gramEnd"/>
-      <w:r>
-        <w:rPr>
-          <w:i/>
-          <w:iCs/>
-          <w:sz w:val="18"/>
-          <w:szCs w:val="18"/>
-        </w:rPr>
-        <w:t xml:space="preserve">  2025/26</w:t>
+        <w:t>LETI — Licenciatura em Engenharia de Telecomunicações e Informática  |  2025/26</w:t>
       </w:r>
     </w:p>
     <w:p>
@@ -123,14 +103,7 @@
           <w:sz w:val="18"/>
           <w:szCs w:val="18"/>
         </w:rPr>
-        <w:t>, sendo a Iteração 01 a que contém os artefactos UML produzidos nesta fase: diagrama de domínio, casos de uso, diagramas de sequência do sistema (SSD), diagrama de classes e diagrama de pacotes. Os dados são persistidos em ficheiros binários, seguin</w:t>
-      </w:r>
-      <w:r>
-        <w:rPr>
-          <w:sz w:val="18"/>
-          <w:szCs w:val="18"/>
-        </w:rPr>
-        <w:t>do as restrições da unidade curricular Fundamentos de Desenvolvimento de Software (FSOFT) do ISEP.</w:t>
+        <w:t>, sendo a Iteração 01 a que contém os artefactos UML produzidos nesta fase: diagrama de domínio, casos de uso, diagramas de sequência do sistema (SSD), diagrama de classes e diagrama de pacotes. Os dados são persistidos em ficheiros binários, seguindo as restrições da unidade curricular Fundamentos de Desenvolvimento de Software (FSOFT) do ISEP.</w:t>
       </w:r>
     </w:p>
     <w:p>
@@ -658,18 +631,13 @@
       </w:r>
       <w:proofErr w:type="spellEnd"/>
       <w:r>
-        <w:t xml:space="preserve"> está organizado da seguinte forma. A raiz contém o </w:t>
-      </w:r>
-      <w:proofErr w:type="gramStart"/>
-      <w:r>
-        <w:t>ficheiro .</w:t>
+        <w:t xml:space="preserve"> está organizado da seguinte forma. A raiz contém o ficheiro .</w:t>
       </w:r>
       <w:proofErr w:type="spellStart"/>
       <w:r>
         <w:t>gitignore</w:t>
       </w:r>
       <w:proofErr w:type="spellEnd"/>
-      <w:proofErr w:type="gramEnd"/>
       <w:r>
         <w:t xml:space="preserve"> que exclui pastas geradas pelo </w:t>
       </w:r>
@@ -723,16 +691,7 @@
           <w:sz w:val="18"/>
           <w:szCs w:val="18"/>
         </w:rPr>
-        <w:t xml:space="preserve">│ </w:t>
-      </w:r>
-      <w:proofErr w:type="gramStart"/>
-      <w:r>
-        <w:rPr>
-          <w:rFonts w:ascii="Courier New" w:eastAsia="Courier New" w:hAnsi="Courier New" w:cs="Courier New"/>
-          <w:sz w:val="18"/>
-          <w:szCs w:val="18"/>
-        </w:rPr>
-        <w:t xml:space="preserve">  .</w:t>
+        <w:t>│   .</w:t>
       </w:r>
       <w:proofErr w:type="spellStart"/>
       <w:r>
@@ -744,7 +703,6 @@
         <w:t>gitignore</w:t>
       </w:r>
       <w:proofErr w:type="spellEnd"/>
-      <w:proofErr w:type="gramEnd"/>
     </w:p>
     <w:p>
       <w:pPr>
@@ -838,19 +796,9 @@
           <w:sz w:val="18"/>
           <w:szCs w:val="18"/>
         </w:rPr>
-        <w:t>class_</w:t>
-      </w:r>
-      <w:proofErr w:type="gramStart"/>
-      <w:r>
-        <w:rPr>
-          <w:rFonts w:ascii="Courier New" w:eastAsia="Courier New" w:hAnsi="Courier New" w:cs="Courier New"/>
-          <w:sz w:val="18"/>
-          <w:szCs w:val="18"/>
-        </w:rPr>
-        <w:t>diagram.puml</w:t>
+        <w:t>class_diagram.puml</w:t>
       </w:r>
       <w:proofErr w:type="spellEnd"/>
-      <w:proofErr w:type="gramEnd"/>
     </w:p>
     <w:p>
       <w:pPr>
@@ -877,19 +825,9 @@
           <w:sz w:val="18"/>
           <w:szCs w:val="18"/>
         </w:rPr>
-        <w:t>domain_</w:t>
-      </w:r>
-      <w:proofErr w:type="gramStart"/>
-      <w:r>
-        <w:rPr>
-          <w:rFonts w:ascii="Courier New" w:eastAsia="Courier New" w:hAnsi="Courier New" w:cs="Courier New"/>
-          <w:sz w:val="18"/>
-          <w:szCs w:val="18"/>
-        </w:rPr>
-        <w:t>model.puml</w:t>
+        <w:t>domain_model.puml</w:t>
       </w:r>
       <w:proofErr w:type="spellEnd"/>
-      <w:proofErr w:type="gramEnd"/>
     </w:p>
     <w:p>
       <w:pPr>
@@ -916,19 +854,9 @@
           <w:sz w:val="18"/>
           <w:szCs w:val="18"/>
         </w:rPr>
-        <w:t>package_</w:t>
-      </w:r>
-      <w:proofErr w:type="gramStart"/>
-      <w:r>
-        <w:rPr>
-          <w:rFonts w:ascii="Courier New" w:eastAsia="Courier New" w:hAnsi="Courier New" w:cs="Courier New"/>
-          <w:sz w:val="18"/>
-          <w:szCs w:val="18"/>
-        </w:rPr>
-        <w:t>diagram.puml</w:t>
+        <w:t>package_diagram.puml</w:t>
       </w:r>
       <w:proofErr w:type="spellEnd"/>
-      <w:proofErr w:type="gramEnd"/>
     </w:p>
     <w:p>
       <w:pPr>
@@ -955,19 +883,9 @@
           <w:sz w:val="18"/>
           <w:szCs w:val="18"/>
         </w:rPr>
-        <w:t>ssd_consultar_</w:t>
-      </w:r>
-      <w:proofErr w:type="gramStart"/>
-      <w:r>
-        <w:rPr>
-          <w:rFonts w:ascii="Courier New" w:eastAsia="Courier New" w:hAnsi="Courier New" w:cs="Courier New"/>
-          <w:sz w:val="18"/>
-          <w:szCs w:val="18"/>
-        </w:rPr>
-        <w:t>classificacao.puml</w:t>
+        <w:t>ssd_consultar_classificacao.puml</w:t>
       </w:r>
       <w:proofErr w:type="spellEnd"/>
-      <w:proofErr w:type="gramEnd"/>
     </w:p>
     <w:p>
       <w:pPr>
@@ -994,19 +912,9 @@
           <w:sz w:val="18"/>
           <w:szCs w:val="18"/>
         </w:rPr>
-        <w:t>ssd_criar_</w:t>
-      </w:r>
-      <w:proofErr w:type="gramStart"/>
-      <w:r>
-        <w:rPr>
-          <w:rFonts w:ascii="Courier New" w:eastAsia="Courier New" w:hAnsi="Courier New" w:cs="Courier New"/>
-          <w:sz w:val="18"/>
-          <w:szCs w:val="18"/>
-        </w:rPr>
-        <w:t>piloto.puml</w:t>
+        <w:t>ssd_criar_piloto.puml</w:t>
       </w:r>
       <w:proofErr w:type="spellEnd"/>
-      <w:proofErr w:type="gramEnd"/>
     </w:p>
     <w:p>
       <w:pPr>
@@ -1033,19 +941,9 @@
           <w:sz w:val="18"/>
           <w:szCs w:val="18"/>
         </w:rPr>
-        <w:t>ssd_registar_</w:t>
-      </w:r>
-      <w:proofErr w:type="gramStart"/>
-      <w:r>
-        <w:rPr>
-          <w:rFonts w:ascii="Courier New" w:eastAsia="Courier New" w:hAnsi="Courier New" w:cs="Courier New"/>
-          <w:sz w:val="18"/>
-          <w:szCs w:val="18"/>
-        </w:rPr>
-        <w:t>participacao.puml</w:t>
+        <w:t>ssd_registar_participacao.puml</w:t>
       </w:r>
       <w:proofErr w:type="spellEnd"/>
-      <w:proofErr w:type="gramEnd"/>
     </w:p>
     <w:p>
       <w:pPr>
@@ -1072,19 +970,9 @@
           <w:sz w:val="18"/>
           <w:szCs w:val="18"/>
         </w:rPr>
-        <w:t>use_</w:t>
-      </w:r>
-      <w:proofErr w:type="gramStart"/>
-      <w:r>
-        <w:rPr>
-          <w:rFonts w:ascii="Courier New" w:eastAsia="Courier New" w:hAnsi="Courier New" w:cs="Courier New"/>
-          <w:sz w:val="18"/>
-          <w:szCs w:val="18"/>
-        </w:rPr>
-        <w:t>cases.puml</w:t>
+        <w:t>use_cases.puml</w:t>
       </w:r>
       <w:proofErr w:type="spellEnd"/>
-      <w:proofErr w:type="gramEnd"/>
     </w:p>
     <w:p>
       <w:pPr>
@@ -1290,18 +1178,13 @@
         <w:jc w:val="both"/>
       </w:pPr>
       <w:r>
-        <w:t xml:space="preserve">As </w:t>
-      </w:r>
-      <w:proofErr w:type="gramStart"/>
-      <w:r>
-        <w:t>pastas .</w:t>
+        <w:t>As pastas .</w:t>
       </w:r>
       <w:proofErr w:type="spellStart"/>
       <w:r>
         <w:t>idea</w:t>
       </w:r>
       <w:proofErr w:type="spellEnd"/>
-      <w:proofErr w:type="gramEnd"/>
       <w:r>
         <w:t xml:space="preserve"> e </w:t>
       </w:r>
@@ -1319,18 +1202,13 @@
       </w:r>
       <w:proofErr w:type="spellEnd"/>
       <w:r>
-        <w:t xml:space="preserve"> e pelo CMake e estão excluídas do repositório através </w:t>
-      </w:r>
-      <w:proofErr w:type="gramStart"/>
-      <w:r>
-        <w:t>do .</w:t>
+        <w:t xml:space="preserve"> e pelo CMake e estão excluídas do repositório através do .</w:t>
       </w:r>
       <w:proofErr w:type="spellStart"/>
       <w:r>
         <w:t>gitignore</w:t>
       </w:r>
       <w:proofErr w:type="spellEnd"/>
-      <w:proofErr w:type="gramEnd"/>
       <w:r>
         <w:t>.</w:t>
       </w:r>
@@ -1359,14 +1237,9 @@
       </w:r>
       <w:proofErr w:type="spellStart"/>
       <w:r>
-        <w:t>domain_</w:t>
-      </w:r>
-      <w:proofErr w:type="gramStart"/>
-      <w:r>
-        <w:t>model.puml</w:t>
+        <w:t>domain_model.puml</w:t>
       </w:r>
       <w:proofErr w:type="spellEnd"/>
-      <w:proofErr w:type="gramEnd"/>
       <w:r>
         <w:t>) identifica as entidades relevantes do sistema e as relações entre elas, servindo de base para o desenho das classes de implementação.</w:t>
       </w:r>
@@ -1787,23 +1660,13 @@
         <w:pStyle w:val="Ttulo2"/>
       </w:pPr>
       <w:r>
-        <w:t xml:space="preserve">4.1   Diagrama de Casos de </w:t>
-      </w:r>
-      <w:proofErr w:type="gramStart"/>
-      <w:r>
-        <w:t>Uso  (</w:t>
+        <w:t>4.1   Diagrama de Casos de Uso  (</w:t>
       </w:r>
       <w:proofErr w:type="spellStart"/>
-      <w:proofErr w:type="gramEnd"/>
-      <w:r>
-        <w:t>use_</w:t>
-      </w:r>
-      <w:proofErr w:type="gramStart"/>
-      <w:r>
-        <w:t>cases.puml</w:t>
+      <w:r>
+        <w:t>use_cases.puml</w:t>
       </w:r>
       <w:proofErr w:type="spellEnd"/>
-      <w:proofErr w:type="gramEnd"/>
       <w:r>
         <w:t>)</w:t>
       </w:r>
@@ -1931,23 +1794,7 @@
         <w:spacing w:before="40" w:after="40"/>
       </w:pPr>
       <w:r>
-        <w:t>UC</w:t>
-      </w:r>
-      <w:proofErr w:type="gramStart"/>
-      <w:r>
-        <w:t>9  —</w:t>
-      </w:r>
-      <w:proofErr w:type="gramEnd"/>
-      <w:r>
-        <w:t xml:space="preserve"> Registar </w:t>
-      </w:r>
-      <w:proofErr w:type="gramStart"/>
-      <w:r>
-        <w:t>Participação  (</w:t>
-      </w:r>
-      <w:proofErr w:type="gramEnd"/>
-      <w:r>
-        <w:t>inclui: Selecionar Piloto, Selecionar Corrida)</w:t>
+        <w:t>UC9  — Registar Participação  (inclui: Selecionar Piloto, Selecionar Corrida)</w:t>
       </w:r>
     </w:p>
     <w:p>
@@ -1960,15 +1807,7 @@
         <w:spacing w:before="40" w:after="40"/>
       </w:pPr>
       <w:r>
-        <w:t xml:space="preserve">UC10 — Consultar </w:t>
-      </w:r>
-      <w:proofErr w:type="gramStart"/>
-      <w:r>
-        <w:t>Classificação  (</w:t>
-      </w:r>
-      <w:proofErr w:type="gramEnd"/>
-      <w:r>
-        <w:t>inclui: Selecionar Corrida)</w:t>
+        <w:t>UC10 — Consultar Classificação  (inclui: Selecionar Corrida)</w:t>
       </w:r>
     </w:p>
     <w:p>
@@ -2939,14 +2778,9 @@
           <w:p>
             <w:proofErr w:type="spellStart"/>
             <w:r>
-              <w:t>ssd_criar_</w:t>
-            </w:r>
-            <w:proofErr w:type="gramStart"/>
-            <w:r>
-              <w:t>piloto.puml</w:t>
+              <w:t>ssd_criar_piloto.puml</w:t>
             </w:r>
             <w:proofErr w:type="spellEnd"/>
-            <w:proofErr w:type="gramEnd"/>
           </w:p>
         </w:tc>
         <w:tc>
@@ -3002,14 +2836,9 @@
           <w:p>
             <w:proofErr w:type="spellStart"/>
             <w:r>
-              <w:t>ssd_registar_</w:t>
-            </w:r>
-            <w:proofErr w:type="gramStart"/>
-            <w:r>
-              <w:t>participacao.puml</w:t>
+              <w:t>ssd_registar_participacao.puml</w:t>
             </w:r>
             <w:proofErr w:type="spellEnd"/>
-            <w:proofErr w:type="gramEnd"/>
           </w:p>
         </w:tc>
         <w:tc>
@@ -3031,15 +2860,7 @@
           </w:tcPr>
           <w:p>
             <w:r>
-              <w:t xml:space="preserve">UC9 — Registar Participação: </w:t>
-            </w:r>
-            <w:proofErr w:type="spellStart"/>
-            <w:r>
-              <w:t>seleccionar</w:t>
-            </w:r>
-            <w:proofErr w:type="spellEnd"/>
-            <w:r>
-              <w:t xml:space="preserve"> piloto e corrida, introduzir resultados, validar e guardar.</w:t>
+              <w:t>UC9 — Registar Participação: selecionar piloto e corrida, introduzir resultados, validar e guardar.</w:t>
             </w:r>
           </w:p>
         </w:tc>
@@ -3065,14 +2886,9 @@
           <w:p>
             <w:proofErr w:type="spellStart"/>
             <w:r>
-              <w:t>ssd_consultar_</w:t>
-            </w:r>
-            <w:proofErr w:type="gramStart"/>
-            <w:r>
-              <w:t>classificacao.puml</w:t>
+              <w:t>ssd_consultar_classificacao.puml</w:t>
             </w:r>
             <w:proofErr w:type="spellEnd"/>
-            <w:proofErr w:type="gramEnd"/>
           </w:p>
         </w:tc>
         <w:tc>
@@ -3094,15 +2910,7 @@
           </w:tcPr>
           <w:p>
             <w:r>
-              <w:t xml:space="preserve">UC10 — Consultar Classificação: </w:t>
-            </w:r>
-            <w:proofErr w:type="spellStart"/>
-            <w:r>
-              <w:t>seleccionar</w:t>
-            </w:r>
-            <w:proofErr w:type="spellEnd"/>
-            <w:r>
-              <w:t xml:space="preserve"> corrida, obter e ordenar participações.</w:t>
+              <w:t>UC10 — Consultar Classificação: selecionar corrida, obter e ordenar participações.</w:t>
             </w:r>
           </w:p>
         </w:tc>
@@ -3127,23 +2935,13 @@
         <w:pStyle w:val="Ttulo2"/>
       </w:pPr>
       <w:r>
-        <w:t xml:space="preserve">5.1   Organização em </w:t>
-      </w:r>
-      <w:proofErr w:type="gramStart"/>
-      <w:r>
-        <w:t>Camadas  (</w:t>
+        <w:t>5.1   Organização em Camadas  (</w:t>
       </w:r>
       <w:proofErr w:type="spellStart"/>
-      <w:proofErr w:type="gramEnd"/>
-      <w:r>
-        <w:t>class_</w:t>
-      </w:r>
-      <w:proofErr w:type="gramStart"/>
-      <w:r>
-        <w:t>diagram.puml</w:t>
+      <w:r>
+        <w:t>class_diagram.puml</w:t>
       </w:r>
       <w:proofErr w:type="spellEnd"/>
-      <w:proofErr w:type="gramEnd"/>
       <w:r>
         <w:t>)</w:t>
       </w:r>
@@ -3182,14 +2980,9 @@
       </w:r>
       <w:proofErr w:type="spellStart"/>
       <w:r>
-        <w:t>class_</w:t>
-      </w:r>
-      <w:proofErr w:type="gramStart"/>
-      <w:r>
-        <w:t>diagram.puml</w:t>
+        <w:t>class_diagram.puml</w:t>
       </w:r>
       <w:proofErr w:type="spellEnd"/>
-      <w:proofErr w:type="gramEnd"/>
       <w:r>
         <w:t>):</w:t>
       </w:r>
@@ -3329,23 +3122,13 @@
         <w:pStyle w:val="Ttulo2"/>
       </w:pPr>
       <w:r>
-        <w:t xml:space="preserve">5.2   Estrutura de </w:t>
-      </w:r>
-      <w:proofErr w:type="gramStart"/>
-      <w:r>
-        <w:t>Pacotes  (</w:t>
+        <w:t>5.2   Estrutura de Pacotes  (</w:t>
       </w:r>
       <w:proofErr w:type="spellStart"/>
-      <w:proofErr w:type="gramEnd"/>
-      <w:r>
-        <w:t>package_</w:t>
-      </w:r>
-      <w:proofErr w:type="gramStart"/>
-      <w:r>
-        <w:t>diagram.puml</w:t>
+      <w:r>
+        <w:t>package_diagram.puml</w:t>
       </w:r>
       <w:proofErr w:type="spellEnd"/>
-      <w:proofErr w:type="gramEnd"/>
       <w:r>
         <w:t>)</w:t>
       </w:r>
@@ -3360,14 +3143,9 @@
       </w:r>
       <w:proofErr w:type="spellStart"/>
       <w:r>
-        <w:t>package_</w:t>
-      </w:r>
-      <w:proofErr w:type="gramStart"/>
-      <w:r>
-        <w:t>diagram.puml</w:t>
+        <w:t>package_diagram.puml</w:t>
       </w:r>
       <w:proofErr w:type="spellEnd"/>
-      <w:proofErr w:type="gramEnd"/>
       <w:r>
         <w:t xml:space="preserve">) complementa o diagrama de classes ao mostrar a organização física dos ficheiros fonte dentro da pasta Project, as dependências entre pacotes e os ficheiros de dados binários gerados em </w:t>
       </w:r>
@@ -3524,15 +3302,7 @@
           </w:tcPr>
           <w:p>
             <w:r>
-              <w:t xml:space="preserve">Piloto, Equipa, </w:t>
-            </w:r>
-            <w:proofErr w:type="gramStart"/>
-            <w:r>
-              <w:t>Veiculo</w:t>
-            </w:r>
-            <w:proofErr w:type="gramEnd"/>
-            <w:r>
-              <w:t xml:space="preserve">, Corrida, </w:t>
+              <w:t xml:space="preserve">Piloto, Equipa, Veiculo, Corrida, </w:t>
             </w:r>
             <w:proofErr w:type="spellStart"/>
             <w:r>
@@ -3957,10 +3727,7 @@
         <w:t xml:space="preserve">Carlos </w:t>
       </w:r>
       <w:r>
-        <w:t>Freitas</w:t>
-      </w:r>
-      <w:r>
-        <w:t xml:space="preserve">: </w:t>
+        <w:t xml:space="preserve">Freitas: </w:t>
       </w:r>
       <w:proofErr w:type="spellStart"/>
       <w:r>
@@ -4705,6 +4472,7 @@
   <w:style w:type="character" w:default="1" w:styleId="Tipodeletrapredefinidodopargrafo">
     <w:name w:val="Default Paragraph Font"/>
     <w:uiPriority w:val="1"/>
+    <w:semiHidden/>
     <w:unhideWhenUsed/>
   </w:style>
   <w:style w:type="table" w:default="1" w:styleId="Tabelanormal">
@@ -5131,6 +4899,23 @@
 </file>
 
 <file path=customXml/item1.xml><?xml version="1.0" encoding="utf-8"?>
+<p:properties xmlns:p="http://schemas.microsoft.com/office/2006/metadata/properties" xmlns:xsi="http://www.w3.org/2001/XMLSchema-instance" xmlns:pc="http://schemas.microsoft.com/office/infopath/2007/PartnerControls">
+  <documentManagement>
+    <_activity xmlns="0dcc1a40-ea0e-47d8-a039-1dac49932a50" xsi:nil="true"/>
+  </documentManagement>
+</p:properties>
+</file>
+
+<file path=customXml/item2.xml><?xml version="1.0" encoding="utf-8"?>
+<?mso-contentType ?>
+<FormTemplates xmlns="http://schemas.microsoft.com/sharepoint/v3/contenttype/forms">
+  <Display>DocumentLibraryForm</Display>
+  <Edit>DocumentLibraryForm</Edit>
+  <New>DocumentLibraryForm</New>
+</FormTemplates>
+</file>
+
+<file path=customXml/item3.xml><?xml version="1.0" encoding="utf-8"?>
 <ct:contentTypeSchema xmlns:ct="http://schemas.microsoft.com/office/2006/metadata/contentType" xmlns:ma="http://schemas.microsoft.com/office/2006/metadata/properties/metaAttributes" ct:_="" ma:_="" ma:contentTypeName="Document" ma:contentTypeID="0x01010084FBBC41F098C44BA41DB754347C7BC3" ma:contentTypeVersion="6" ma:contentTypeDescription="Create a new document." ma:contentTypeScope="" ma:versionID="192c9ba2479eb5323960d55e1076841e">
   <xsd:schema xmlns:xsd="http://www.w3.org/2001/XMLSchema" xmlns:xs="http://www.w3.org/2001/XMLSchema" xmlns:p="http://schemas.microsoft.com/office/2006/metadata/properties" xmlns:ns3="0dcc1a40-ea0e-47d8-a039-1dac49932a50" targetNamespace="http://schemas.microsoft.com/office/2006/metadata/properties" ma:root="true" ma:fieldsID="538bd0c5fa219a5e681903271b05c9bc" ns3:_="">
     <xsd:import namespace="0dcc1a40-ea0e-47d8-a039-1dac49932a50"/>
@@ -5286,24 +5071,25 @@
 </ct:contentTypeSchema>
 </file>
 
-<file path=customXml/item2.xml><?xml version="1.0" encoding="utf-8"?>
-<?mso-contentType ?>
-<FormTemplates xmlns="http://schemas.microsoft.com/sharepoint/v3/contenttype/forms">
-  <Display>DocumentLibraryForm</Display>
-  <Edit>DocumentLibraryForm</Edit>
-  <New>DocumentLibraryForm</New>
-</FormTemplates>
+<file path=customXml/itemProps1.xml><?xml version="1.0" encoding="utf-8"?>
+<ds:datastoreItem xmlns:ds="http://schemas.openxmlformats.org/officeDocument/2006/customXml" ds:itemID="{215D48A3-1F03-496E-8438-941A494C4533}">
+  <ds:schemaRefs>
+    <ds:schemaRef ds:uri="http://schemas.microsoft.com/office/2006/metadata/properties"/>
+    <ds:schemaRef ds:uri="http://schemas.microsoft.com/office/infopath/2007/PartnerControls"/>
+    <ds:schemaRef ds:uri="0dcc1a40-ea0e-47d8-a039-1dac49932a50"/>
+  </ds:schemaRefs>
+</ds:datastoreItem>
 </file>
 
-<file path=customXml/item3.xml><?xml version="1.0" encoding="utf-8"?>
-<p:properties xmlns:p="http://schemas.microsoft.com/office/2006/metadata/properties" xmlns:xsi="http://www.w3.org/2001/XMLSchema-instance" xmlns:pc="http://schemas.microsoft.com/office/infopath/2007/PartnerControls">
-  <documentManagement>
-    <_activity xmlns="0dcc1a40-ea0e-47d8-a039-1dac49932a50" xsi:nil="true"/>
-  </documentManagement>
-</p:properties>
+<file path=customXml/itemProps2.xml><?xml version="1.0" encoding="utf-8"?>
+<ds:datastoreItem xmlns:ds="http://schemas.openxmlformats.org/officeDocument/2006/customXml" ds:itemID="{0CA7B765-6DF9-49EC-BD22-E21135EF939E}">
+  <ds:schemaRefs>
+    <ds:schemaRef ds:uri="http://schemas.microsoft.com/sharepoint/v3/contenttype/forms"/>
+  </ds:schemaRefs>
+</ds:datastoreItem>
 </file>
 
-<file path=customXml/itemProps1.xml><?xml version="1.0" encoding="utf-8"?>
+<file path=customXml/itemProps3.xml><?xml version="1.0" encoding="utf-8"?>
 <ds:datastoreItem xmlns:ds="http://schemas.openxmlformats.org/officeDocument/2006/customXml" ds:itemID="{F6ABFCA7-6E12-4013-8F34-339A8E91A759}">
   <ds:schemaRefs>
     <ds:schemaRef ds:uri="http://schemas.microsoft.com/office/2006/metadata/contentType"/>
@@ -5319,22 +5105,4 @@
     <ds:schemaRef ds:uri="http://schemas.microsoft.com/internal/obd"/>
   </ds:schemaRefs>
 </ds:datastoreItem>
-</file>
-
-<file path=customXml/itemProps2.xml><?xml version="1.0" encoding="utf-8"?>
-<ds:datastoreItem xmlns:ds="http://schemas.openxmlformats.org/officeDocument/2006/customXml" ds:itemID="{0CA7B765-6DF9-49EC-BD22-E21135EF939E}">
-  <ds:schemaRefs>
-    <ds:schemaRef ds:uri="http://schemas.microsoft.com/sharepoint/v3/contenttype/forms"/>
-  </ds:schemaRefs>
-</ds:datastoreItem>
-</file>
-
-<file path=customXml/itemProps3.xml><?xml version="1.0" encoding="utf-8"?>
-<ds:datastoreItem xmlns:ds="http://schemas.openxmlformats.org/officeDocument/2006/customXml" ds:itemID="{215D48A3-1F03-496E-8438-941A494C4533}">
-  <ds:schemaRefs>
-    <ds:schemaRef ds:uri="http://schemas.microsoft.com/office/2006/metadata/properties"/>
-    <ds:schemaRef ds:uri="http://schemas.microsoft.com/office/infopath/2007/PartnerControls"/>
-    <ds:schemaRef ds:uri="0dcc1a40-ea0e-47d8-a039-1dac49932a50"/>
-  </ds:schemaRefs>
-</ds:datastoreItem>
 </file>
</xml_diff>

<commit_message>
gitignore c++ e intellij
</commit_message>
<xml_diff>
--- a/Documentation/Iteration01/relatorio_gestao_pilotos_fsoft.docx
+++ b/Documentation/Iteration01/relatorio_gestao_pilotos_fsoft.docx
@@ -123,14 +123,7 @@
           <w:sz w:val="18"/>
           <w:szCs w:val="18"/>
         </w:rPr>
-        <w:t>, sendo a Iteração 01 a que contém os artefactos UML produzidos nesta fase: diagrama de domínio, casos de uso, diagramas de sequência do sistema (SSD), diagrama de classes e diagrama de pacotes. Os dados são persistidos em ficheiros binários, seguin</w:t>
-      </w:r>
-      <w:r>
-        <w:rPr>
-          <w:sz w:val="18"/>
-          <w:szCs w:val="18"/>
-        </w:rPr>
-        <w:t>do as restrições da unidade curricular Fundamentos de Desenvolvimento de Software (FSOFT) do ISEP.</w:t>
+        <w:t>, sendo a Iteração 01 a que contém os artefactos UML produzidos nesta fase: diagrama de domínio, casos de uso, diagramas de sequência do sistema (SSD), diagrama de classes e diagrama de pacotes. Os dados são persistidos em ficheiros binários, seguindo as restrições da unidade curricular Fundamentos de Desenvolvimento de Software (FSOFT) do ISEP.</w:t>
       </w:r>
     </w:p>
     <w:p>
@@ -679,7 +672,15 @@
       </w:r>
       <w:proofErr w:type="spellEnd"/>
       <w:r>
-        <w:t xml:space="preserve"> e pelo CMake, mantendo apenas os </w:t>
+        <w:t xml:space="preserve"> e pelo </w:t>
+      </w:r>
+      <w:proofErr w:type="spellStart"/>
+      <w:r>
+        <w:t>CMake</w:t>
+      </w:r>
+      <w:proofErr w:type="spellEnd"/>
+      <w:r>
+        <w:t xml:space="preserve">, mantendo apenas os </w:t>
       </w:r>
       <w:r>
         <w:t>pastas/ficheiros</w:t>
@@ -821,13 +822,15 @@
           <w:rFonts w:ascii="Courier New" w:eastAsia="Courier New" w:hAnsi="Courier New" w:cs="Courier New"/>
           <w:sz w:val="18"/>
           <w:szCs w:val="18"/>
-        </w:rPr>
-      </w:pPr>
-      <w:r>
-        <w:rPr>
-          <w:rFonts w:ascii="Courier New" w:eastAsia="Courier New" w:hAnsi="Courier New" w:cs="Courier New"/>
-          <w:sz w:val="18"/>
-          <w:szCs w:val="18"/>
+          <w:lang w:val="en-GB"/>
+        </w:rPr>
+      </w:pPr>
+      <w:r>
+        <w:rPr>
+          <w:rFonts w:ascii="Courier New" w:eastAsia="Courier New" w:hAnsi="Courier New" w:cs="Courier New"/>
+          <w:sz w:val="18"/>
+          <w:szCs w:val="18"/>
+          <w:lang w:val="en-GB"/>
         </w:rPr>
         <w:t xml:space="preserve">│   │       </w:t>
       </w:r>
@@ -837,6 +840,7 @@
           <w:rFonts w:ascii="Courier New" w:eastAsia="Courier New" w:hAnsi="Courier New" w:cs="Courier New"/>
           <w:sz w:val="18"/>
           <w:szCs w:val="18"/>
+          <w:lang w:val="en-GB"/>
         </w:rPr>
         <w:t>class_</w:t>
       </w:r>
@@ -846,6 +850,7 @@
           <w:rFonts w:ascii="Courier New" w:eastAsia="Courier New" w:hAnsi="Courier New" w:cs="Courier New"/>
           <w:sz w:val="18"/>
           <w:szCs w:val="18"/>
+          <w:lang w:val="en-GB"/>
         </w:rPr>
         <w:t>diagram.puml</w:t>
       </w:r>
@@ -860,13 +865,15 @@
           <w:rFonts w:ascii="Courier New" w:eastAsia="Courier New" w:hAnsi="Courier New" w:cs="Courier New"/>
           <w:sz w:val="18"/>
           <w:szCs w:val="18"/>
-        </w:rPr>
-      </w:pPr>
-      <w:r>
-        <w:rPr>
-          <w:rFonts w:ascii="Courier New" w:eastAsia="Courier New" w:hAnsi="Courier New" w:cs="Courier New"/>
-          <w:sz w:val="18"/>
-          <w:szCs w:val="18"/>
+          <w:lang w:val="en-GB"/>
+        </w:rPr>
+      </w:pPr>
+      <w:r>
+        <w:rPr>
+          <w:rFonts w:ascii="Courier New" w:eastAsia="Courier New" w:hAnsi="Courier New" w:cs="Courier New"/>
+          <w:sz w:val="18"/>
+          <w:szCs w:val="18"/>
+          <w:lang w:val="en-GB"/>
         </w:rPr>
         <w:t xml:space="preserve">│   │       </w:t>
       </w:r>
@@ -876,6 +883,7 @@
           <w:rFonts w:ascii="Courier New" w:eastAsia="Courier New" w:hAnsi="Courier New" w:cs="Courier New"/>
           <w:sz w:val="18"/>
           <w:szCs w:val="18"/>
+          <w:lang w:val="en-GB"/>
         </w:rPr>
         <w:t>domain_</w:t>
       </w:r>
@@ -885,6 +893,7 @@
           <w:rFonts w:ascii="Courier New" w:eastAsia="Courier New" w:hAnsi="Courier New" w:cs="Courier New"/>
           <w:sz w:val="18"/>
           <w:szCs w:val="18"/>
+          <w:lang w:val="en-GB"/>
         </w:rPr>
         <w:t>model.puml</w:t>
       </w:r>
@@ -1319,7 +1328,15 @@
       </w:r>
       <w:proofErr w:type="spellEnd"/>
       <w:r>
-        <w:t xml:space="preserve"> e pelo CMake e estão excluídas do repositório através </w:t>
+        <w:t xml:space="preserve"> e pelo </w:t>
+      </w:r>
+      <w:proofErr w:type="spellStart"/>
+      <w:r>
+        <w:t>CMake</w:t>
+      </w:r>
+      <w:proofErr w:type="spellEnd"/>
+      <w:r>
+        <w:t xml:space="preserve"> e estão excluídas do repositório através </w:t>
       </w:r>
       <w:proofErr w:type="gramStart"/>
       <w:r>
@@ -3031,15 +3048,7 @@
           </w:tcPr>
           <w:p>
             <w:r>
-              <w:t xml:space="preserve">UC9 — Registar Participação: </w:t>
-            </w:r>
-            <w:proofErr w:type="spellStart"/>
-            <w:r>
-              <w:t>seleccionar</w:t>
-            </w:r>
-            <w:proofErr w:type="spellEnd"/>
-            <w:r>
-              <w:t xml:space="preserve"> piloto e corrida, introduzir resultados, validar e guardar.</w:t>
+              <w:t>UC9 — Registar Participação: selecionar piloto e corrida, introduzir resultados, validar e guardar.</w:t>
             </w:r>
           </w:p>
         </w:tc>
@@ -3094,15 +3103,7 @@
           </w:tcPr>
           <w:p>
             <w:r>
-              <w:t xml:space="preserve">UC10 — Consultar Classificação: </w:t>
-            </w:r>
-            <w:proofErr w:type="spellStart"/>
-            <w:r>
-              <w:t>seleccionar</w:t>
-            </w:r>
-            <w:proofErr w:type="spellEnd"/>
-            <w:r>
-              <w:t xml:space="preserve"> corrida, obter e ordenar participações.</w:t>
+              <w:t>UC10 — Consultar Classificação: selecionar corrida, obter e ordenar participações.</w:t>
             </w:r>
           </w:p>
         </w:tc>
@@ -3957,10 +3958,7 @@
         <w:t xml:space="preserve">Carlos </w:t>
       </w:r>
       <w:r>
-        <w:t>Freitas</w:t>
-      </w:r>
-      <w:r>
-        <w:t xml:space="preserve">: </w:t>
+        <w:t xml:space="preserve">Freitas: </w:t>
       </w:r>
       <w:proofErr w:type="spellStart"/>
       <w:r>
@@ -4705,6 +4703,7 @@
   <w:style w:type="character" w:default="1" w:styleId="Tipodeletrapredefinidodopargrafo">
     <w:name w:val="Default Paragraph Font"/>
     <w:uiPriority w:val="1"/>
+    <w:semiHidden/>
     <w:unhideWhenUsed/>
   </w:style>
   <w:style w:type="table" w:default="1" w:styleId="Tabelanormal">
@@ -5131,6 +5130,23 @@
 </file>
 
 <file path=customXml/item1.xml><?xml version="1.0" encoding="utf-8"?>
+<p:properties xmlns:p="http://schemas.microsoft.com/office/2006/metadata/properties" xmlns:xsi="http://www.w3.org/2001/XMLSchema-instance" xmlns:pc="http://schemas.microsoft.com/office/infopath/2007/PartnerControls">
+  <documentManagement>
+    <_activity xmlns="0dcc1a40-ea0e-47d8-a039-1dac49932a50" xsi:nil="true"/>
+  </documentManagement>
+</p:properties>
+</file>
+
+<file path=customXml/item2.xml><?xml version="1.0" encoding="utf-8"?>
+<?mso-contentType ?>
+<FormTemplates xmlns="http://schemas.microsoft.com/sharepoint/v3/contenttype/forms">
+  <Display>DocumentLibraryForm</Display>
+  <Edit>DocumentLibraryForm</Edit>
+  <New>DocumentLibraryForm</New>
+</FormTemplates>
+</file>
+
+<file path=customXml/item3.xml><?xml version="1.0" encoding="utf-8"?>
 <ct:contentTypeSchema xmlns:ct="http://schemas.microsoft.com/office/2006/metadata/contentType" xmlns:ma="http://schemas.microsoft.com/office/2006/metadata/properties/metaAttributes" ct:_="" ma:_="" ma:contentTypeName="Document" ma:contentTypeID="0x01010084FBBC41F098C44BA41DB754347C7BC3" ma:contentTypeVersion="6" ma:contentTypeDescription="Create a new document." ma:contentTypeScope="" ma:versionID="192c9ba2479eb5323960d55e1076841e">
   <xsd:schema xmlns:xsd="http://www.w3.org/2001/XMLSchema" xmlns:xs="http://www.w3.org/2001/XMLSchema" xmlns:p="http://schemas.microsoft.com/office/2006/metadata/properties" xmlns:ns3="0dcc1a40-ea0e-47d8-a039-1dac49932a50" targetNamespace="http://schemas.microsoft.com/office/2006/metadata/properties" ma:root="true" ma:fieldsID="538bd0c5fa219a5e681903271b05c9bc" ns3:_="">
     <xsd:import namespace="0dcc1a40-ea0e-47d8-a039-1dac49932a50"/>
@@ -5286,24 +5302,25 @@
 </ct:contentTypeSchema>
 </file>
 
-<file path=customXml/item2.xml><?xml version="1.0" encoding="utf-8"?>
-<?mso-contentType ?>
-<FormTemplates xmlns="http://schemas.microsoft.com/sharepoint/v3/contenttype/forms">
-  <Display>DocumentLibraryForm</Display>
-  <Edit>DocumentLibraryForm</Edit>
-  <New>DocumentLibraryForm</New>
-</FormTemplates>
+<file path=customXml/itemProps1.xml><?xml version="1.0" encoding="utf-8"?>
+<ds:datastoreItem xmlns:ds="http://schemas.openxmlformats.org/officeDocument/2006/customXml" ds:itemID="{215D48A3-1F03-496E-8438-941A494C4533}">
+  <ds:schemaRefs>
+    <ds:schemaRef ds:uri="http://schemas.microsoft.com/office/2006/metadata/properties"/>
+    <ds:schemaRef ds:uri="http://schemas.microsoft.com/office/infopath/2007/PartnerControls"/>
+    <ds:schemaRef ds:uri="0dcc1a40-ea0e-47d8-a039-1dac49932a50"/>
+  </ds:schemaRefs>
+</ds:datastoreItem>
 </file>
 
-<file path=customXml/item3.xml><?xml version="1.0" encoding="utf-8"?>
-<p:properties xmlns:p="http://schemas.microsoft.com/office/2006/metadata/properties" xmlns:xsi="http://www.w3.org/2001/XMLSchema-instance" xmlns:pc="http://schemas.microsoft.com/office/infopath/2007/PartnerControls">
-  <documentManagement>
-    <_activity xmlns="0dcc1a40-ea0e-47d8-a039-1dac49932a50" xsi:nil="true"/>
-  </documentManagement>
-</p:properties>
+<file path=customXml/itemProps2.xml><?xml version="1.0" encoding="utf-8"?>
+<ds:datastoreItem xmlns:ds="http://schemas.openxmlformats.org/officeDocument/2006/customXml" ds:itemID="{0CA7B765-6DF9-49EC-BD22-E21135EF939E}">
+  <ds:schemaRefs>
+    <ds:schemaRef ds:uri="http://schemas.microsoft.com/sharepoint/v3/contenttype/forms"/>
+  </ds:schemaRefs>
+</ds:datastoreItem>
 </file>
 
-<file path=customXml/itemProps1.xml><?xml version="1.0" encoding="utf-8"?>
+<file path=customXml/itemProps3.xml><?xml version="1.0" encoding="utf-8"?>
 <ds:datastoreItem xmlns:ds="http://schemas.openxmlformats.org/officeDocument/2006/customXml" ds:itemID="{F6ABFCA7-6E12-4013-8F34-339A8E91A759}">
   <ds:schemaRefs>
     <ds:schemaRef ds:uri="http://schemas.microsoft.com/office/2006/metadata/contentType"/>
@@ -5319,22 +5336,4 @@
     <ds:schemaRef ds:uri="http://schemas.microsoft.com/internal/obd"/>
   </ds:schemaRefs>
 </ds:datastoreItem>
-</file>
-
-<file path=customXml/itemProps2.xml><?xml version="1.0" encoding="utf-8"?>
-<ds:datastoreItem xmlns:ds="http://schemas.openxmlformats.org/officeDocument/2006/customXml" ds:itemID="{0CA7B765-6DF9-49EC-BD22-E21135EF939E}">
-  <ds:schemaRefs>
-    <ds:schemaRef ds:uri="http://schemas.microsoft.com/sharepoint/v3/contenttype/forms"/>
-  </ds:schemaRefs>
-</ds:datastoreItem>
-</file>
-
-<file path=customXml/itemProps3.xml><?xml version="1.0" encoding="utf-8"?>
-<ds:datastoreItem xmlns:ds="http://schemas.openxmlformats.org/officeDocument/2006/customXml" ds:itemID="{215D48A3-1F03-496E-8438-941A494C4533}">
-  <ds:schemaRefs>
-    <ds:schemaRef ds:uri="http://schemas.microsoft.com/office/2006/metadata/properties"/>
-    <ds:schemaRef ds:uri="http://schemas.microsoft.com/office/infopath/2007/PartnerControls"/>
-    <ds:schemaRef ds:uri="0dcc1a40-ea0e-47d8-a039-1dac49932a50"/>
-  </ds:schemaRefs>
-</ds:datastoreItem>
 </file>
</xml_diff>

<commit_message>
small change on the second point of the project
</commit_message>
<xml_diff>
--- a/Documentation/Iteration01/relatorio_gestao_pilotos_fsoft.docx
+++ b/Documentation/Iteration01/relatorio_gestao_pilotos_fsoft.docx
@@ -62,7 +62,6 @@
         <w:spacing w:before="200" w:after="80"/>
         <w:ind w:left="720" w:right="720"/>
       </w:pPr>
-      <w:proofErr w:type="spellStart"/>
       <w:r>
         <w:rPr>
           <w:b/>
@@ -70,9 +69,21 @@
           <w:sz w:val="18"/>
           <w:szCs w:val="18"/>
         </w:rPr>
-        <w:t>Abstract</w:t>
-      </w:r>
-      <w:proofErr w:type="spellEnd"/>
+        <w:t xml:space="preserve">Abstract. </w:t>
+      </w:r>
+      <w:r>
+        <w:rPr>
+          <w:sz w:val="18"/>
+          <w:szCs w:val="18"/>
+        </w:rPr>
+        <w:t>Este documento apresenta a análise de requisitos e a arquitetura de um sistema de gestão de pilotos de automobilismo, desenvolvido como aplicação de linha de comandos (CLI) em C++. O projeto encontra-se organizado em três iterações dentro da pasta Documentation, sendo a Iteração 01 a que contém os artefactos UML produzidos nesta fase: diagrama de domínio, casos de uso, diagramas de sequência do sistema (SSD), diagrama de classes e diagrama de pacotes. Os dados são persistidos em ficheiros binários, seguindo as restrições da unidade curricular Fundamentos de Desenvolvimento de Software (FSOFT) do ISEP.</w:t>
+      </w:r>
+    </w:p>
+    <w:p>
+      <w:pPr>
+        <w:spacing w:before="80" w:after="200"/>
+        <w:ind w:left="720" w:right="720"/>
+      </w:pPr>
       <w:r>
         <w:rPr>
           <w:b/>
@@ -80,79 +91,14 @@
           <w:sz w:val="18"/>
           <w:szCs w:val="18"/>
         </w:rPr>
-        <w:t xml:space="preserve">. </w:t>
-      </w:r>
-      <w:r>
-        <w:rPr>
-          <w:sz w:val="18"/>
-          <w:szCs w:val="18"/>
-        </w:rPr>
-        <w:t xml:space="preserve">Este documento apresenta a análise de requisitos e a arquitetura de um sistema de gestão de pilotos de automobilismo, desenvolvido como aplicação de linha de comandos (CLI) em C++. O projeto encontra-se organizado em três iterações dentro da pasta </w:t>
-      </w:r>
-      <w:proofErr w:type="spellStart"/>
-      <w:r>
-        <w:rPr>
-          <w:sz w:val="18"/>
-          <w:szCs w:val="18"/>
-        </w:rPr>
-        <w:t>Documentation</w:t>
-      </w:r>
-      <w:proofErr w:type="spellEnd"/>
-      <w:r>
-        <w:rPr>
-          <w:sz w:val="18"/>
-          <w:szCs w:val="18"/>
-        </w:rPr>
-        <w:t>, sendo a Iteração 01 a que contém os artefactos UML produzidos nesta fase: diagrama de domínio, casos de uso, diagramas de sequência do sistema (SSD), diagrama de classes e diagrama de pacotes. Os dados são persistidos em ficheiros binários, seguindo as restrições da unidade curricular Fundamentos de Desenvolvimento de Software (FSOFT) do ISEP.</w:t>
-      </w:r>
-    </w:p>
-    <w:p>
-      <w:pPr>
-        <w:spacing w:before="80" w:after="200"/>
-        <w:ind w:left="720" w:right="720"/>
-      </w:pPr>
-      <w:proofErr w:type="spellStart"/>
-      <w:r>
-        <w:rPr>
-          <w:b/>
-          <w:bCs/>
-          <w:sz w:val="18"/>
-          <w:szCs w:val="18"/>
-        </w:rPr>
-        <w:t>Keywords</w:t>
-      </w:r>
-      <w:proofErr w:type="spellEnd"/>
-      <w:r>
-        <w:rPr>
-          <w:b/>
-          <w:bCs/>
-          <w:sz w:val="18"/>
-          <w:szCs w:val="18"/>
-        </w:rPr>
-        <w:t xml:space="preserve">: </w:t>
-      </w:r>
-      <w:r>
-        <w:rPr>
-          <w:sz w:val="18"/>
-          <w:szCs w:val="18"/>
-        </w:rPr>
-        <w:t xml:space="preserve">automobilismo, gestão de pilotos, C++, CLI, UML, análise de requisitos, </w:t>
-      </w:r>
-      <w:proofErr w:type="spellStart"/>
-      <w:r>
-        <w:rPr>
-          <w:sz w:val="18"/>
-          <w:szCs w:val="18"/>
-        </w:rPr>
-        <w:t>PlantUML</w:t>
-      </w:r>
-      <w:proofErr w:type="spellEnd"/>
-      <w:r>
-        <w:rPr>
-          <w:sz w:val="18"/>
-          <w:szCs w:val="18"/>
-        </w:rPr>
-        <w:t>.</w:t>
+        <w:t xml:space="preserve">Keywords: </w:t>
+      </w:r>
+      <w:r>
+        <w:rPr>
+          <w:sz w:val="18"/>
+          <w:szCs w:val="18"/>
+        </w:rPr>
+        <w:t>automobilismo, gestão de pilotos, C++, CLI, UML, análise de requisitos, PlantUML.</w:t>
       </w:r>
     </w:p>
     <w:p>
@@ -623,31 +569,7 @@
         <w:jc w:val="both"/>
       </w:pPr>
       <w:r>
-        <w:t xml:space="preserve">O repositório </w:t>
-      </w:r>
-      <w:proofErr w:type="spellStart"/>
-      <w:r>
-        <w:t>Git</w:t>
-      </w:r>
-      <w:proofErr w:type="spellEnd"/>
-      <w:r>
-        <w:t xml:space="preserve"> está organizado da seguinte forma. A raiz contém o ficheiro .</w:t>
-      </w:r>
-      <w:proofErr w:type="spellStart"/>
-      <w:r>
-        <w:t>gitignore</w:t>
-      </w:r>
-      <w:proofErr w:type="spellEnd"/>
-      <w:r>
-        <w:t xml:space="preserve"> que exclui pastas geradas pelo </w:t>
-      </w:r>
-      <w:proofErr w:type="spellStart"/>
-      <w:r>
-        <w:t>CLion</w:t>
-      </w:r>
-      <w:proofErr w:type="spellEnd"/>
-      <w:r>
-        <w:t xml:space="preserve"> e pelo CMake, mantendo apenas os </w:t>
+        <w:t xml:space="preserve">O repositório Git está organizado da seguinte forma. A raiz contém o ficheiro .gitignore que exclui pastas geradas pelo CLion e pelo CMake, mantendo apenas os </w:t>
       </w:r>
       <w:r>
         <w:t>pastas/ficheiros</w:t>
@@ -691,18 +613,8 @@
           <w:sz w:val="18"/>
           <w:szCs w:val="18"/>
         </w:rPr>
-        <w:t>│   .</w:t>
-      </w:r>
-      <w:proofErr w:type="spellStart"/>
-      <w:r>
-        <w:rPr>
-          <w:rFonts w:ascii="Courier New" w:eastAsia="Courier New" w:hAnsi="Courier New" w:cs="Courier New"/>
-          <w:sz w:val="18"/>
-          <w:szCs w:val="18"/>
-        </w:rPr>
-        <w:t>gitignore</w:t>
-      </w:r>
-      <w:proofErr w:type="spellEnd"/>
+        <w:t>│   .gitignore</w:t>
+      </w:r>
     </w:p>
     <w:p>
       <w:pPr>
@@ -739,18 +651,8 @@
           <w:sz w:val="18"/>
           <w:szCs w:val="18"/>
         </w:rPr>
-        <w:t>├───</w:t>
-      </w:r>
-      <w:proofErr w:type="spellStart"/>
-      <w:r>
-        <w:rPr>
-          <w:rFonts w:ascii="Courier New" w:eastAsia="Courier New" w:hAnsi="Courier New" w:cs="Courier New"/>
-          <w:sz w:val="18"/>
-          <w:szCs w:val="18"/>
-        </w:rPr>
-        <w:t>Documentation</w:t>
-      </w:r>
-      <w:proofErr w:type="spellEnd"/>
+        <w:t>├───Documentation</w:t>
+      </w:r>
     </w:p>
     <w:p>
       <w:pPr>
@@ -787,18 +689,8 @@
           <w:sz w:val="18"/>
           <w:szCs w:val="18"/>
         </w:rPr>
-        <w:t xml:space="preserve">│   │       </w:t>
-      </w:r>
-      <w:proofErr w:type="spellStart"/>
-      <w:r>
-        <w:rPr>
-          <w:rFonts w:ascii="Courier New" w:eastAsia="Courier New" w:hAnsi="Courier New" w:cs="Courier New"/>
-          <w:sz w:val="18"/>
-          <w:szCs w:val="18"/>
-        </w:rPr>
-        <w:t>class_diagram.puml</w:t>
-      </w:r>
-      <w:proofErr w:type="spellEnd"/>
+        <w:t>│   │       class_diagram.puml</w:t>
+      </w:r>
     </w:p>
     <w:p>
       <w:pPr>
@@ -816,18 +708,8 @@
           <w:sz w:val="18"/>
           <w:szCs w:val="18"/>
         </w:rPr>
-        <w:t xml:space="preserve">│   │       </w:t>
-      </w:r>
-      <w:proofErr w:type="spellStart"/>
-      <w:r>
-        <w:rPr>
-          <w:rFonts w:ascii="Courier New" w:eastAsia="Courier New" w:hAnsi="Courier New" w:cs="Courier New"/>
-          <w:sz w:val="18"/>
-          <w:szCs w:val="18"/>
-        </w:rPr>
-        <w:t>domain_model.puml</w:t>
-      </w:r>
-      <w:proofErr w:type="spellEnd"/>
+        <w:t>│   │       domain_model.puml</w:t>
+      </w:r>
     </w:p>
     <w:p>
       <w:pPr>
@@ -845,18 +727,8 @@
           <w:sz w:val="18"/>
           <w:szCs w:val="18"/>
         </w:rPr>
-        <w:t xml:space="preserve">│   │       </w:t>
-      </w:r>
-      <w:proofErr w:type="spellStart"/>
-      <w:r>
-        <w:rPr>
-          <w:rFonts w:ascii="Courier New" w:eastAsia="Courier New" w:hAnsi="Courier New" w:cs="Courier New"/>
-          <w:sz w:val="18"/>
-          <w:szCs w:val="18"/>
-        </w:rPr>
-        <w:t>package_diagram.puml</w:t>
-      </w:r>
-      <w:proofErr w:type="spellEnd"/>
+        <w:t>│   │       package_diagram.puml</w:t>
+      </w:r>
     </w:p>
     <w:p>
       <w:pPr>
@@ -874,18 +746,8 @@
           <w:sz w:val="18"/>
           <w:szCs w:val="18"/>
         </w:rPr>
-        <w:t xml:space="preserve">│   │       </w:t>
-      </w:r>
-      <w:proofErr w:type="spellStart"/>
-      <w:r>
-        <w:rPr>
-          <w:rFonts w:ascii="Courier New" w:eastAsia="Courier New" w:hAnsi="Courier New" w:cs="Courier New"/>
-          <w:sz w:val="18"/>
-          <w:szCs w:val="18"/>
-        </w:rPr>
-        <w:t>ssd_consultar_classificacao.puml</w:t>
-      </w:r>
-      <w:proofErr w:type="spellEnd"/>
+        <w:t>│   │       ssd_consultar_classificacao.puml</w:t>
+      </w:r>
     </w:p>
     <w:p>
       <w:pPr>
@@ -903,18 +765,8 @@
           <w:sz w:val="18"/>
           <w:szCs w:val="18"/>
         </w:rPr>
-        <w:t xml:space="preserve">│   │       </w:t>
-      </w:r>
-      <w:proofErr w:type="spellStart"/>
-      <w:r>
-        <w:rPr>
-          <w:rFonts w:ascii="Courier New" w:eastAsia="Courier New" w:hAnsi="Courier New" w:cs="Courier New"/>
-          <w:sz w:val="18"/>
-          <w:szCs w:val="18"/>
-        </w:rPr>
-        <w:t>ssd_criar_piloto.puml</w:t>
-      </w:r>
-      <w:proofErr w:type="spellEnd"/>
+        <w:t>│   │       ssd_criar_piloto.puml</w:t>
+      </w:r>
     </w:p>
     <w:p>
       <w:pPr>
@@ -932,18 +784,8 @@
           <w:sz w:val="18"/>
           <w:szCs w:val="18"/>
         </w:rPr>
-        <w:t xml:space="preserve">│   │       </w:t>
-      </w:r>
-      <w:proofErr w:type="spellStart"/>
-      <w:r>
-        <w:rPr>
-          <w:rFonts w:ascii="Courier New" w:eastAsia="Courier New" w:hAnsi="Courier New" w:cs="Courier New"/>
-          <w:sz w:val="18"/>
-          <w:szCs w:val="18"/>
-        </w:rPr>
-        <w:t>ssd_registar_participacao.puml</w:t>
-      </w:r>
-      <w:proofErr w:type="spellEnd"/>
+        <w:t>│   │       ssd_registar_participacao.puml</w:t>
+      </w:r>
     </w:p>
     <w:p>
       <w:pPr>
@@ -961,18 +803,8 @@
           <w:sz w:val="18"/>
           <w:szCs w:val="18"/>
         </w:rPr>
-        <w:t xml:space="preserve">│   │       </w:t>
-      </w:r>
-      <w:proofErr w:type="spellStart"/>
-      <w:r>
-        <w:rPr>
-          <w:rFonts w:ascii="Courier New" w:eastAsia="Courier New" w:hAnsi="Courier New" w:cs="Courier New"/>
-          <w:sz w:val="18"/>
-          <w:szCs w:val="18"/>
-        </w:rPr>
-        <w:t>use_cases.puml</w:t>
-      </w:r>
-      <w:proofErr w:type="spellEnd"/>
+        <w:t>│   │       use_cases.puml</w:t>
+      </w:r>
     </w:p>
     <w:p>
       <w:pPr>
@@ -992,6 +824,15 @@
         </w:rPr>
         <w:t>│   │</w:t>
       </w:r>
+      <w:r>
+        <w:rPr>
+          <w:rFonts w:ascii="Courier New" w:eastAsia="Courier New" w:hAnsi="Courier New" w:cs="Courier New"/>
+          <w:sz w:val="18"/>
+          <w:szCs w:val="18"/>
+        </w:rPr>
+        <w:tab/>
+        <w:t xml:space="preserve">  uc1.puml</w:t>
+      </w:r>
     </w:p>
     <w:p>
       <w:pPr>
@@ -1009,7 +850,32 @@
           <w:sz w:val="18"/>
           <w:szCs w:val="18"/>
         </w:rPr>
-        <w:t>│   ├───Iteration02</w:t>
+        <w:t>│   │</w:t>
+      </w:r>
+      <w:r>
+        <w:rPr>
+          <w:rFonts w:ascii="Courier New" w:eastAsia="Courier New" w:hAnsi="Courier New" w:cs="Courier New"/>
+          <w:sz w:val="18"/>
+          <w:szCs w:val="18"/>
+        </w:rPr>
+        <w:tab/>
+        <w:t xml:space="preserve">  uc</w:t>
+      </w:r>
+      <w:r>
+        <w:rPr>
+          <w:rFonts w:ascii="Courier New" w:eastAsia="Courier New" w:hAnsi="Courier New" w:cs="Courier New"/>
+          <w:sz w:val="18"/>
+          <w:szCs w:val="18"/>
+        </w:rPr>
+        <w:t>2</w:t>
+      </w:r>
+      <w:r>
+        <w:rPr>
+          <w:rFonts w:ascii="Courier New" w:eastAsia="Courier New" w:hAnsi="Courier New" w:cs="Courier New"/>
+          <w:sz w:val="18"/>
+          <w:szCs w:val="18"/>
+        </w:rPr>
+        <w:t>.puml</w:t>
       </w:r>
     </w:p>
     <w:p>
@@ -1028,7 +894,32 @@
           <w:sz w:val="18"/>
           <w:szCs w:val="18"/>
         </w:rPr>
-        <w:t xml:space="preserve">│   │       </w:t>
+        <w:t>│   │</w:t>
+      </w:r>
+      <w:r>
+        <w:rPr>
+          <w:rFonts w:ascii="Courier New" w:eastAsia="Courier New" w:hAnsi="Courier New" w:cs="Courier New"/>
+          <w:sz w:val="18"/>
+          <w:szCs w:val="18"/>
+        </w:rPr>
+        <w:tab/>
+        <w:t xml:space="preserve">  uc</w:t>
+      </w:r>
+      <w:r>
+        <w:rPr>
+          <w:rFonts w:ascii="Courier New" w:eastAsia="Courier New" w:hAnsi="Courier New" w:cs="Courier New"/>
+          <w:sz w:val="18"/>
+          <w:szCs w:val="18"/>
+        </w:rPr>
+        <w:t>3</w:t>
+      </w:r>
+      <w:r>
+        <w:rPr>
+          <w:rFonts w:ascii="Courier New" w:eastAsia="Courier New" w:hAnsi="Courier New" w:cs="Courier New"/>
+          <w:sz w:val="18"/>
+          <w:szCs w:val="18"/>
+        </w:rPr>
+        <w:t>.puml</w:t>
       </w:r>
     </w:p>
     <w:p>
@@ -1047,7 +938,32 @@
           <w:sz w:val="18"/>
           <w:szCs w:val="18"/>
         </w:rPr>
-        <w:t>│   └───Iteration03</w:t>
+        <w:t>│   │</w:t>
+      </w:r>
+      <w:r>
+        <w:rPr>
+          <w:rFonts w:ascii="Courier New" w:eastAsia="Courier New" w:hAnsi="Courier New" w:cs="Courier New"/>
+          <w:sz w:val="18"/>
+          <w:szCs w:val="18"/>
+        </w:rPr>
+        <w:tab/>
+        <w:t xml:space="preserve">  uc</w:t>
+      </w:r>
+      <w:r>
+        <w:rPr>
+          <w:rFonts w:ascii="Courier New" w:eastAsia="Courier New" w:hAnsi="Courier New" w:cs="Courier New"/>
+          <w:sz w:val="18"/>
+          <w:szCs w:val="18"/>
+        </w:rPr>
+        <w:t>4</w:t>
+      </w:r>
+      <w:r>
+        <w:rPr>
+          <w:rFonts w:ascii="Courier New" w:eastAsia="Courier New" w:hAnsi="Courier New" w:cs="Courier New"/>
+          <w:sz w:val="18"/>
+          <w:szCs w:val="18"/>
+        </w:rPr>
+        <w:t>.puml</w:t>
       </w:r>
     </w:p>
     <w:p>
@@ -1066,7 +982,32 @@
           <w:sz w:val="18"/>
           <w:szCs w:val="18"/>
         </w:rPr>
-        <w:t>│</w:t>
+        <w:t>│   │</w:t>
+      </w:r>
+      <w:r>
+        <w:rPr>
+          <w:rFonts w:ascii="Courier New" w:eastAsia="Courier New" w:hAnsi="Courier New" w:cs="Courier New"/>
+          <w:sz w:val="18"/>
+          <w:szCs w:val="18"/>
+        </w:rPr>
+        <w:tab/>
+        <w:t xml:space="preserve">  uc</w:t>
+      </w:r>
+      <w:r>
+        <w:rPr>
+          <w:rFonts w:ascii="Courier New" w:eastAsia="Courier New" w:hAnsi="Courier New" w:cs="Courier New"/>
+          <w:sz w:val="18"/>
+          <w:szCs w:val="18"/>
+        </w:rPr>
+        <w:t>5</w:t>
+      </w:r>
+      <w:r>
+        <w:rPr>
+          <w:rFonts w:ascii="Courier New" w:eastAsia="Courier New" w:hAnsi="Courier New" w:cs="Courier New"/>
+          <w:sz w:val="18"/>
+          <w:szCs w:val="18"/>
+        </w:rPr>
+        <w:t>.puml</w:t>
       </w:r>
     </w:p>
     <w:p>
@@ -1085,7 +1026,32 @@
           <w:sz w:val="18"/>
           <w:szCs w:val="18"/>
         </w:rPr>
-        <w:t>├───Project</w:t>
+        <w:t>│   │</w:t>
+      </w:r>
+      <w:r>
+        <w:rPr>
+          <w:rFonts w:ascii="Courier New" w:eastAsia="Courier New" w:hAnsi="Courier New" w:cs="Courier New"/>
+          <w:sz w:val="18"/>
+          <w:szCs w:val="18"/>
+        </w:rPr>
+        <w:tab/>
+        <w:t xml:space="preserve">  uc</w:t>
+      </w:r>
+      <w:r>
+        <w:rPr>
+          <w:rFonts w:ascii="Courier New" w:eastAsia="Courier New" w:hAnsi="Courier New" w:cs="Courier New"/>
+          <w:sz w:val="18"/>
+          <w:szCs w:val="18"/>
+        </w:rPr>
+        <w:t>6</w:t>
+      </w:r>
+      <w:r>
+        <w:rPr>
+          <w:rFonts w:ascii="Courier New" w:eastAsia="Courier New" w:hAnsi="Courier New" w:cs="Courier New"/>
+          <w:sz w:val="18"/>
+          <w:szCs w:val="18"/>
+        </w:rPr>
+        <w:t>.puml</w:t>
       </w:r>
     </w:p>
     <w:p>
@@ -1104,7 +1070,32 @@
           <w:sz w:val="18"/>
           <w:szCs w:val="18"/>
         </w:rPr>
-        <w:t>│   │   CMakeLists.txt</w:t>
+        <w:t>│   │</w:t>
+      </w:r>
+      <w:r>
+        <w:rPr>
+          <w:rFonts w:ascii="Courier New" w:eastAsia="Courier New" w:hAnsi="Courier New" w:cs="Courier New"/>
+          <w:sz w:val="18"/>
+          <w:szCs w:val="18"/>
+        </w:rPr>
+        <w:tab/>
+        <w:t xml:space="preserve">  uc</w:t>
+      </w:r>
+      <w:r>
+        <w:rPr>
+          <w:rFonts w:ascii="Courier New" w:eastAsia="Courier New" w:hAnsi="Courier New" w:cs="Courier New"/>
+          <w:sz w:val="18"/>
+          <w:szCs w:val="18"/>
+        </w:rPr>
+        <w:t>7</w:t>
+      </w:r>
+      <w:r>
+        <w:rPr>
+          <w:rFonts w:ascii="Courier New" w:eastAsia="Courier New" w:hAnsi="Courier New" w:cs="Courier New"/>
+          <w:sz w:val="18"/>
+          <w:szCs w:val="18"/>
+        </w:rPr>
+        <w:t>.puml</w:t>
       </w:r>
     </w:p>
     <w:p>
@@ -1123,7 +1114,32 @@
           <w:sz w:val="18"/>
           <w:szCs w:val="18"/>
         </w:rPr>
-        <w:t>│   │   main.cpp</w:t>
+        <w:t>│   │</w:t>
+      </w:r>
+      <w:r>
+        <w:rPr>
+          <w:rFonts w:ascii="Courier New" w:eastAsia="Courier New" w:hAnsi="Courier New" w:cs="Courier New"/>
+          <w:sz w:val="18"/>
+          <w:szCs w:val="18"/>
+        </w:rPr>
+        <w:tab/>
+        <w:t xml:space="preserve">  uc</w:t>
+      </w:r>
+      <w:r>
+        <w:rPr>
+          <w:rFonts w:ascii="Courier New" w:eastAsia="Courier New" w:hAnsi="Courier New" w:cs="Courier New"/>
+          <w:sz w:val="18"/>
+          <w:szCs w:val="18"/>
+        </w:rPr>
+        <w:t>8</w:t>
+      </w:r>
+      <w:r>
+        <w:rPr>
+          <w:rFonts w:ascii="Courier New" w:eastAsia="Courier New" w:hAnsi="Courier New" w:cs="Courier New"/>
+          <w:sz w:val="18"/>
+          <w:szCs w:val="18"/>
+        </w:rPr>
+        <w:t>.puml</w:t>
       </w:r>
     </w:p>
     <w:p>
@@ -1142,7 +1158,32 @@
           <w:sz w:val="18"/>
           <w:szCs w:val="18"/>
         </w:rPr>
-        <w:t>│   │   main.exe</w:t>
+        <w:t>│   │</w:t>
+      </w:r>
+      <w:r>
+        <w:rPr>
+          <w:rFonts w:ascii="Courier New" w:eastAsia="Courier New" w:hAnsi="Courier New" w:cs="Courier New"/>
+          <w:sz w:val="18"/>
+          <w:szCs w:val="18"/>
+        </w:rPr>
+        <w:tab/>
+        <w:t xml:space="preserve">  uc</w:t>
+      </w:r>
+      <w:r>
+        <w:rPr>
+          <w:rFonts w:ascii="Courier New" w:eastAsia="Courier New" w:hAnsi="Courier New" w:cs="Courier New"/>
+          <w:sz w:val="18"/>
+          <w:szCs w:val="18"/>
+        </w:rPr>
+        <w:t>9</w:t>
+      </w:r>
+      <w:r>
+        <w:rPr>
+          <w:rFonts w:ascii="Courier New" w:eastAsia="Courier New" w:hAnsi="Courier New" w:cs="Courier New"/>
+          <w:sz w:val="18"/>
+          <w:szCs w:val="18"/>
+        </w:rPr>
+        <w:t>.puml</w:t>
       </w:r>
     </w:p>
     <w:p>
@@ -1161,6 +1202,202 @@
           <w:sz w:val="18"/>
           <w:szCs w:val="18"/>
         </w:rPr>
+        <w:t>│   │</w:t>
+      </w:r>
+      <w:r>
+        <w:rPr>
+          <w:rFonts w:ascii="Courier New" w:eastAsia="Courier New" w:hAnsi="Courier New" w:cs="Courier New"/>
+          <w:sz w:val="18"/>
+          <w:szCs w:val="18"/>
+        </w:rPr>
+        <w:tab/>
+        <w:t xml:space="preserve">  uc</w:t>
+      </w:r>
+      <w:r>
+        <w:rPr>
+          <w:rFonts w:ascii="Courier New" w:eastAsia="Courier New" w:hAnsi="Courier New" w:cs="Courier New"/>
+          <w:sz w:val="18"/>
+          <w:szCs w:val="18"/>
+        </w:rPr>
+        <w:t>10</w:t>
+      </w:r>
+      <w:r>
+        <w:rPr>
+          <w:rFonts w:ascii="Courier New" w:eastAsia="Courier New" w:hAnsi="Courier New" w:cs="Courier New"/>
+          <w:sz w:val="18"/>
+          <w:szCs w:val="18"/>
+        </w:rPr>
+        <w:t>.puml</w:t>
+      </w:r>
+    </w:p>
+    <w:p>
+      <w:pPr>
+        <w:spacing w:before="100" w:after="100"/>
+        <w:ind w:left="360"/>
+        <w:rPr>
+          <w:rFonts w:ascii="Courier New" w:eastAsia="Courier New" w:hAnsi="Courier New" w:cs="Courier New"/>
+          <w:sz w:val="18"/>
+          <w:szCs w:val="18"/>
+        </w:rPr>
+      </w:pPr>
+      <w:r>
+        <w:rPr>
+          <w:rFonts w:ascii="Courier New" w:eastAsia="Courier New" w:hAnsi="Courier New" w:cs="Courier New"/>
+          <w:sz w:val="18"/>
+          <w:szCs w:val="18"/>
+        </w:rPr>
+        <w:t>│   ├───Iteration02</w:t>
+      </w:r>
+    </w:p>
+    <w:p>
+      <w:pPr>
+        <w:spacing w:before="100" w:after="100"/>
+        <w:ind w:left="360"/>
+        <w:rPr>
+          <w:rFonts w:ascii="Courier New" w:eastAsia="Courier New" w:hAnsi="Courier New" w:cs="Courier New"/>
+          <w:sz w:val="18"/>
+          <w:szCs w:val="18"/>
+        </w:rPr>
+      </w:pPr>
+      <w:r>
+        <w:rPr>
+          <w:rFonts w:ascii="Courier New" w:eastAsia="Courier New" w:hAnsi="Courier New" w:cs="Courier New"/>
+          <w:sz w:val="18"/>
+          <w:szCs w:val="18"/>
+        </w:rPr>
+        <w:t xml:space="preserve">│   │       </w:t>
+      </w:r>
+    </w:p>
+    <w:p>
+      <w:pPr>
+        <w:spacing w:before="100" w:after="100"/>
+        <w:ind w:left="360"/>
+        <w:rPr>
+          <w:rFonts w:ascii="Courier New" w:eastAsia="Courier New" w:hAnsi="Courier New" w:cs="Courier New"/>
+          <w:sz w:val="18"/>
+          <w:szCs w:val="18"/>
+        </w:rPr>
+      </w:pPr>
+      <w:r>
+        <w:rPr>
+          <w:rFonts w:ascii="Courier New" w:eastAsia="Courier New" w:hAnsi="Courier New" w:cs="Courier New"/>
+          <w:sz w:val="18"/>
+          <w:szCs w:val="18"/>
+        </w:rPr>
+        <w:t>│   └───Iteration03</w:t>
+      </w:r>
+    </w:p>
+    <w:p>
+      <w:pPr>
+        <w:spacing w:before="100" w:after="100"/>
+        <w:ind w:left="360"/>
+        <w:rPr>
+          <w:rFonts w:ascii="Courier New" w:eastAsia="Courier New" w:hAnsi="Courier New" w:cs="Courier New"/>
+          <w:sz w:val="18"/>
+          <w:szCs w:val="18"/>
+        </w:rPr>
+      </w:pPr>
+      <w:r>
+        <w:rPr>
+          <w:rFonts w:ascii="Courier New" w:eastAsia="Courier New" w:hAnsi="Courier New" w:cs="Courier New"/>
+          <w:sz w:val="18"/>
+          <w:szCs w:val="18"/>
+        </w:rPr>
+        <w:t>│</w:t>
+      </w:r>
+    </w:p>
+    <w:p>
+      <w:pPr>
+        <w:spacing w:before="100" w:after="100"/>
+        <w:ind w:left="360"/>
+        <w:rPr>
+          <w:rFonts w:ascii="Courier New" w:eastAsia="Courier New" w:hAnsi="Courier New" w:cs="Courier New"/>
+          <w:sz w:val="18"/>
+          <w:szCs w:val="18"/>
+        </w:rPr>
+      </w:pPr>
+      <w:r>
+        <w:rPr>
+          <w:rFonts w:ascii="Courier New" w:eastAsia="Courier New" w:hAnsi="Courier New" w:cs="Courier New"/>
+          <w:sz w:val="18"/>
+          <w:szCs w:val="18"/>
+        </w:rPr>
+        <w:t>├───Project</w:t>
+      </w:r>
+    </w:p>
+    <w:p>
+      <w:pPr>
+        <w:spacing w:before="100" w:after="100"/>
+        <w:ind w:left="360"/>
+        <w:rPr>
+          <w:rFonts w:ascii="Courier New" w:eastAsia="Courier New" w:hAnsi="Courier New" w:cs="Courier New"/>
+          <w:sz w:val="18"/>
+          <w:szCs w:val="18"/>
+        </w:rPr>
+      </w:pPr>
+      <w:r>
+        <w:rPr>
+          <w:rFonts w:ascii="Courier New" w:eastAsia="Courier New" w:hAnsi="Courier New" w:cs="Courier New"/>
+          <w:sz w:val="18"/>
+          <w:szCs w:val="18"/>
+        </w:rPr>
+        <w:t>│   │   CMakeLists.txt</w:t>
+      </w:r>
+    </w:p>
+    <w:p>
+      <w:pPr>
+        <w:spacing w:before="100" w:after="100"/>
+        <w:ind w:left="360"/>
+        <w:rPr>
+          <w:rFonts w:ascii="Courier New" w:eastAsia="Courier New" w:hAnsi="Courier New" w:cs="Courier New"/>
+          <w:sz w:val="18"/>
+          <w:szCs w:val="18"/>
+        </w:rPr>
+      </w:pPr>
+      <w:r>
+        <w:rPr>
+          <w:rFonts w:ascii="Courier New" w:eastAsia="Courier New" w:hAnsi="Courier New" w:cs="Courier New"/>
+          <w:sz w:val="18"/>
+          <w:szCs w:val="18"/>
+        </w:rPr>
+        <w:t>│   │   main.cpp</w:t>
+      </w:r>
+    </w:p>
+    <w:p>
+      <w:pPr>
+        <w:spacing w:before="100" w:after="100"/>
+        <w:ind w:left="360"/>
+        <w:rPr>
+          <w:rFonts w:ascii="Courier New" w:eastAsia="Courier New" w:hAnsi="Courier New" w:cs="Courier New"/>
+          <w:sz w:val="18"/>
+          <w:szCs w:val="18"/>
+        </w:rPr>
+      </w:pPr>
+      <w:r>
+        <w:rPr>
+          <w:rFonts w:ascii="Courier New" w:eastAsia="Courier New" w:hAnsi="Courier New" w:cs="Courier New"/>
+          <w:sz w:val="18"/>
+          <w:szCs w:val="18"/>
+        </w:rPr>
+        <w:t>│   │   main.exe</w:t>
+      </w:r>
+    </w:p>
+    <w:p>
+      <w:pPr>
+        <w:spacing w:before="100" w:after="100"/>
+        <w:ind w:left="360"/>
+        <w:rPr>
+          <w:rFonts w:ascii="Courier New" w:eastAsia="Courier New" w:hAnsi="Courier New" w:cs="Courier New"/>
+          <w:sz w:val="18"/>
+          <w:szCs w:val="18"/>
+        </w:rPr>
+      </w:pPr>
+      <w:r>
+        <w:rPr>
+          <w:rFonts w:ascii="Courier New" w:eastAsia="Courier New" w:hAnsi="Courier New" w:cs="Courier New"/>
+          <w:sz w:val="18"/>
+          <w:szCs w:val="18"/>
+        </w:rPr>
         <w:t>└───ProjectTester</w:t>
       </w:r>
       <w:r>
@@ -1178,39 +1415,7 @@
         <w:jc w:val="both"/>
       </w:pPr>
       <w:r>
-        <w:t>As pastas .</w:t>
-      </w:r>
-      <w:proofErr w:type="spellStart"/>
-      <w:r>
-        <w:t>idea</w:t>
-      </w:r>
-      <w:proofErr w:type="spellEnd"/>
-      <w:r>
-        <w:t xml:space="preserve"> e </w:t>
-      </w:r>
-      <w:proofErr w:type="spellStart"/>
-      <w:r>
-        <w:t>cmake-build-debug</w:t>
-      </w:r>
-      <w:proofErr w:type="spellEnd"/>
-      <w:r>
-        <w:t xml:space="preserve">, são geradas automaticamente pelo </w:t>
-      </w:r>
-      <w:proofErr w:type="spellStart"/>
-      <w:r>
-        <w:t>CLion</w:t>
-      </w:r>
-      <w:proofErr w:type="spellEnd"/>
-      <w:r>
-        <w:t xml:space="preserve"> e pelo CMake e estão excluídas do repositório através do .</w:t>
-      </w:r>
-      <w:proofErr w:type="spellStart"/>
-      <w:r>
-        <w:t>gitignore</w:t>
-      </w:r>
-      <w:proofErr w:type="spellEnd"/>
-      <w:r>
-        <w:t>.</w:t>
+        <w:t>As pastas .idea e cmake-build-debug, são geradas automaticamente pelo CLion e pelo CMake e estão excluídas do repositório através do .gitignore.</w:t>
       </w:r>
     </w:p>
     <w:p>
@@ -1233,15 +1438,7 @@
         <w:jc w:val="both"/>
       </w:pPr>
       <w:r>
-        <w:t xml:space="preserve">O modelo de domínio (ficheiro </w:t>
-      </w:r>
-      <w:proofErr w:type="spellStart"/>
-      <w:r>
-        <w:t>domain_model.puml</w:t>
-      </w:r>
-      <w:proofErr w:type="spellEnd"/>
-      <w:r>
-        <w:t>) identifica as entidades relevantes do sistema e as relações entre elas, servindo de base para o desenho das classes de implementação.</w:t>
+        <w:t>O modelo de domínio (ficheiro domain_model.puml) identifica as entidades relevantes do sistema e as relações entre elas, servindo de base para o desenho das classes de implementação.</w:t>
       </w:r>
     </w:p>
     <w:p>
@@ -1660,15 +1857,7 @@
         <w:pStyle w:val="Ttulo2"/>
       </w:pPr>
       <w:r>
-        <w:t>4.1   Diagrama de Casos de Uso  (</w:t>
-      </w:r>
-      <w:proofErr w:type="spellStart"/>
-      <w:r>
-        <w:t>use_cases.puml</w:t>
-      </w:r>
-      <w:proofErr w:type="spellEnd"/>
-      <w:r>
-        <w:t>)</w:t>
+        <w:t>4.1   Diagrama de Casos de Uso  (use_cases.puml)</w:t>
       </w:r>
     </w:p>
     <w:p>
@@ -2100,15 +2289,7 @@
           </w:tcPr>
           <w:p>
             <w:r>
-              <w:t xml:space="preserve">1. O Utilizador introduz os dados do piloto (nome, data de </w:t>
-            </w:r>
-            <w:proofErr w:type="spellStart"/>
-            <w:r>
-              <w:t>nasc</w:t>
-            </w:r>
-            <w:proofErr w:type="spellEnd"/>
-            <w:r>
-              <w:t>., licença).</w:t>
+              <w:t>1. O Utilizador introduz os dados do piloto (nome, data de nasc., licença).</w:t>
             </w:r>
           </w:p>
           <w:p>
@@ -2608,15 +2789,7 @@
       </w:pPr>
       <w:r>
         <w:lastRenderedPageBreak/>
-        <w:t>4.4   Diagramas de Sequência do Sistema (</w:t>
-      </w:r>
-      <w:proofErr w:type="spellStart"/>
-      <w:r>
-        <w:t>SSDs</w:t>
-      </w:r>
-      <w:proofErr w:type="spellEnd"/>
-      <w:r>
-        <w:t>)</w:t>
+        <w:t>4.4   Diagramas de Sequência do Sistema (SSDs)</w:t>
       </w:r>
     </w:p>
     <w:p>
@@ -2625,31 +2798,7 @@
         <w:jc w:val="both"/>
       </w:pPr>
       <w:r>
-        <w:t xml:space="preserve">Para cada caso de uso relevante foi elaborado um diagrama SSD em </w:t>
-      </w:r>
-      <w:proofErr w:type="spellStart"/>
-      <w:r>
-        <w:t>PlantUML</w:t>
-      </w:r>
-      <w:proofErr w:type="spellEnd"/>
-      <w:r>
-        <w:t xml:space="preserve">, todos localizados em </w:t>
-      </w:r>
-      <w:proofErr w:type="spellStart"/>
-      <w:r>
-        <w:t>Documentation</w:t>
-      </w:r>
-      <w:proofErr w:type="spellEnd"/>
-      <w:r>
-        <w:t xml:space="preserve">/Iteration01/. Os três </w:t>
-      </w:r>
-      <w:proofErr w:type="spellStart"/>
-      <w:r>
-        <w:t>SSDs</w:t>
-      </w:r>
-      <w:proofErr w:type="spellEnd"/>
-      <w:r>
-        <w:t xml:space="preserve"> produzidos são:</w:t>
+        <w:t>Para cada caso de uso relevante foi elaborado um diagrama SSD em PlantUML, todos localizados em Documentation/Iteration01/. Os três SSDs produzidos são:</w:t>
       </w:r>
     </w:p>
     <w:p>
@@ -2663,21 +2812,12 @@
         </w:rPr>
         <w:t xml:space="preserve">Tabela 5. </w:t>
       </w:r>
-      <w:proofErr w:type="spellStart"/>
       <w:r>
         <w:rPr>
           <w:i/>
           <w:iCs/>
         </w:rPr>
-        <w:t>SSDs</w:t>
-      </w:r>
-      <w:proofErr w:type="spellEnd"/>
-      <w:r>
-        <w:rPr>
-          <w:i/>
-          <w:iCs/>
-        </w:rPr>
-        <w:t xml:space="preserve"> produzidos na Iteração 01.</w:t>
+        <w:t>SSDs produzidos na Iteração 01.</w:t>
       </w:r>
     </w:p>
     <w:tbl>
@@ -2776,11 +2916,9 @@
             </w:tcMar>
           </w:tcPr>
           <w:p>
-            <w:proofErr w:type="spellStart"/>
             <w:r>
               <w:t>ssd_criar_piloto.puml</w:t>
             </w:r>
-            <w:proofErr w:type="spellEnd"/>
           </w:p>
         </w:tc>
         <w:tc>
@@ -2802,15 +2940,7 @@
           </w:tcPr>
           <w:p>
             <w:r>
-              <w:t xml:space="preserve">UC1 — Criar Piloto: entrar dados, validar e armazenar, com bloco </w:t>
-            </w:r>
-            <w:proofErr w:type="spellStart"/>
-            <w:r>
-              <w:t>alt</w:t>
-            </w:r>
-            <w:proofErr w:type="spellEnd"/>
-            <w:r>
-              <w:t xml:space="preserve"> para dados inválidos.</w:t>
+              <w:t>UC1 — Criar Piloto: entrar dados, validar e armazenar, com bloco alt para dados inválidos.</w:t>
             </w:r>
           </w:p>
         </w:tc>
@@ -2834,11 +2964,9 @@
             </w:tcMar>
           </w:tcPr>
           <w:p>
-            <w:proofErr w:type="spellStart"/>
             <w:r>
               <w:t>ssd_registar_participacao.puml</w:t>
             </w:r>
-            <w:proofErr w:type="spellEnd"/>
           </w:p>
         </w:tc>
         <w:tc>
@@ -2884,11 +3012,9 @@
             </w:tcMar>
           </w:tcPr>
           <w:p>
-            <w:proofErr w:type="spellStart"/>
             <w:r>
               <w:t>ssd_consultar_classificacao.puml</w:t>
             </w:r>
-            <w:proofErr w:type="spellEnd"/>
           </w:p>
         </w:tc>
         <w:tc>
@@ -2935,15 +3061,7 @@
         <w:pStyle w:val="Ttulo2"/>
       </w:pPr>
       <w:r>
-        <w:t>5.1   Organização em Camadas  (</w:t>
-      </w:r>
-      <w:proofErr w:type="spellStart"/>
-      <w:r>
-        <w:t>class_diagram.puml</w:t>
-      </w:r>
-      <w:proofErr w:type="spellEnd"/>
-      <w:r>
-        <w:t>)</w:t>
+        <w:t>5.1   Organização em Camadas  (class_diagram.puml)</w:t>
       </w:r>
     </w:p>
     <w:p>
@@ -2976,15 +3094,7 @@
         <w:t>refletida</w:t>
       </w:r>
       <w:r>
-        <w:t xml:space="preserve"> no diagrama de classes (</w:t>
-      </w:r>
-      <w:proofErr w:type="spellStart"/>
-      <w:r>
-        <w:t>class_diagram.puml</w:t>
-      </w:r>
-      <w:proofErr w:type="spellEnd"/>
-      <w:r>
-        <w:t>):</w:t>
+        <w:t xml:space="preserve"> no diagrama de classes (class_diagram.puml):</w:t>
       </w:r>
     </w:p>
     <w:p>
@@ -2996,13 +3106,8 @@
         </w:numPr>
         <w:spacing w:before="40" w:after="40"/>
       </w:pPr>
-      <w:proofErr w:type="spellStart"/>
-      <w:r>
-        <w:t>Model</w:t>
-      </w:r>
-      <w:proofErr w:type="spellEnd"/>
-      <w:r>
-        <w:t xml:space="preserve"> — classes de dados puras: Piloto, Equipa, Veículo, Corrida, Participação.</w:t>
+      <w:r>
+        <w:t>Model — classes de dados puras: Piloto, Equipa, Veículo, Corrida, Participação.</w:t>
       </w:r>
     </w:p>
     <w:p>
@@ -3014,21 +3119,8 @@
         </w:numPr>
         <w:spacing w:before="40" w:after="40"/>
       </w:pPr>
-      <w:proofErr w:type="spellStart"/>
-      <w:r>
-        <w:t>Store</w:t>
-      </w:r>
-      <w:proofErr w:type="spellEnd"/>
-      <w:r>
-        <w:t xml:space="preserve"> — classes de persistência em ficheiros binários (*</w:t>
-      </w:r>
-      <w:proofErr w:type="spellStart"/>
-      <w:r>
-        <w:t>Store.h</w:t>
-      </w:r>
-      <w:proofErr w:type="spellEnd"/>
-      <w:r>
-        <w:t xml:space="preserve"> / *Store.cpp).</w:t>
+      <w:r>
+        <w:t>Store — classes de persistência em ficheiros binários (*Store.h / *Store.cpp).</w:t>
       </w:r>
     </w:p>
     <w:p>
@@ -3040,21 +3132,8 @@
         </w:numPr>
         <w:spacing w:before="40" w:after="40"/>
       </w:pPr>
-      <w:proofErr w:type="spellStart"/>
-      <w:r>
-        <w:t>Controller</w:t>
-      </w:r>
-      <w:proofErr w:type="spellEnd"/>
-      <w:r>
-        <w:t xml:space="preserve"> — classes com a lógica de negócio e validação (*</w:t>
-      </w:r>
-      <w:proofErr w:type="spellStart"/>
-      <w:r>
-        <w:t>Controller.h</w:t>
-      </w:r>
-      <w:proofErr w:type="spellEnd"/>
-      <w:r>
-        <w:t xml:space="preserve"> / *Controller.cpp).</w:t>
+      <w:r>
+        <w:t>Controller — classes com a lógica de negócio e validação (*Controller.h / *Controller.cpp).</w:t>
       </w:r>
     </w:p>
     <w:p>
@@ -3073,15 +3152,7 @@
         <w:t>interação</w:t>
       </w:r>
       <w:r>
-        <w:t xml:space="preserve"> com o utilizador via consola (*</w:t>
-      </w:r>
-      <w:proofErr w:type="spellStart"/>
-      <w:r>
-        <w:t>UI.h</w:t>
-      </w:r>
-      <w:proofErr w:type="spellEnd"/>
-      <w:r>
-        <w:t xml:space="preserve"> / *UI.cpp) e a classe Menu.</w:t>
+        <w:t xml:space="preserve"> com o utilizador via consola (*UI.h / *UI.cpp) e a classe Menu.</w:t>
       </w:r>
     </w:p>
     <w:p>
@@ -3090,31 +3161,7 @@
         <w:jc w:val="both"/>
       </w:pPr>
       <w:r>
-        <w:t xml:space="preserve">As dependências seguem sempre o sentido UI → </w:t>
-      </w:r>
-      <w:proofErr w:type="spellStart"/>
-      <w:r>
-        <w:t>Controller</w:t>
-      </w:r>
-      <w:proofErr w:type="spellEnd"/>
-      <w:r>
-        <w:t xml:space="preserve"> → </w:t>
-      </w:r>
-      <w:proofErr w:type="spellStart"/>
-      <w:r>
-        <w:t>Store</w:t>
-      </w:r>
-      <w:proofErr w:type="spellEnd"/>
-      <w:r>
-        <w:t xml:space="preserve"> → </w:t>
-      </w:r>
-      <w:proofErr w:type="spellStart"/>
-      <w:r>
-        <w:t>Model</w:t>
-      </w:r>
-      <w:proofErr w:type="spellEnd"/>
-      <w:r>
-        <w:t>, garantindo a separação de responsabilidades e facilitando os testes unitários a implementar na pasta ProjectTester.</w:t>
+        <w:t>As dependências seguem sempre o sentido UI → Controller → Store → Model, garantindo a separação de responsabilidades e facilitando os testes unitários a implementar na pasta ProjectTester.</w:t>
       </w:r>
     </w:p>
     <w:p>
@@ -3122,15 +3169,7 @@
         <w:pStyle w:val="Ttulo2"/>
       </w:pPr>
       <w:r>
-        <w:t>5.2   Estrutura de Pacotes  (</w:t>
-      </w:r>
-      <w:proofErr w:type="spellStart"/>
-      <w:r>
-        <w:t>package_diagram.puml</w:t>
-      </w:r>
-      <w:proofErr w:type="spellEnd"/>
-      <w:r>
-        <w:t>)</w:t>
+        <w:t>5.2   Estrutura de Pacotes  (package_diagram.puml)</w:t>
       </w:r>
     </w:p>
     <w:p>
@@ -3139,23 +3178,7 @@
         <w:jc w:val="both"/>
       </w:pPr>
       <w:r>
-        <w:t>O diagrama de pacotes (</w:t>
-      </w:r>
-      <w:proofErr w:type="spellStart"/>
-      <w:r>
-        <w:t>package_diagram.puml</w:t>
-      </w:r>
-      <w:proofErr w:type="spellEnd"/>
-      <w:r>
-        <w:t xml:space="preserve">) complementa o diagrama de classes ao mostrar a organização física dos ficheiros fonte dentro da pasta Project, as dependências entre pacotes e os ficheiros de dados binários gerados em </w:t>
-      </w:r>
-      <w:proofErr w:type="spellStart"/>
-      <w:r>
-        <w:t>runtime</w:t>
-      </w:r>
-      <w:proofErr w:type="spellEnd"/>
-      <w:r>
-        <w:t xml:space="preserve"> na pasta data/.</w:t>
+        <w:t>O diagrama de pacotes (package_diagram.puml) complementa o diagrama de classes ao mostrar a organização física dos ficheiros fonte dentro da pasta Project, as dependências entre pacotes e os ficheiros de dados binários gerados em runtime na pasta data/.</w:t>
       </w:r>
     </w:p>
     <w:p>
@@ -3273,13 +3296,8 @@
             </w:tcMar>
           </w:tcPr>
           <w:p>
-            <w:proofErr w:type="spellStart"/>
-            <w:r>
-              <w:t>model</w:t>
-            </w:r>
-            <w:proofErr w:type="spellEnd"/>
-            <w:r>
-              <w:t>/</w:t>
+            <w:r>
+              <w:t>model/</w:t>
             </w:r>
           </w:p>
         </w:tc>
@@ -3302,23 +3320,7 @@
           </w:tcPr>
           <w:p>
             <w:r>
-              <w:t xml:space="preserve">Piloto, Equipa, Veiculo, Corrida, </w:t>
-            </w:r>
-            <w:proofErr w:type="spellStart"/>
-            <w:r>
-              <w:t>Participacao</w:t>
-            </w:r>
-            <w:proofErr w:type="spellEnd"/>
-            <w:r>
-              <w:t xml:space="preserve"> (.h / .</w:t>
-            </w:r>
-            <w:proofErr w:type="spellStart"/>
-            <w:r>
-              <w:t>cpp</w:t>
-            </w:r>
-            <w:proofErr w:type="spellEnd"/>
-            <w:r>
-              <w:t>)</w:t>
+              <w:t>Piloto, Equipa, Veiculo, Corrida, Participacao (.h / .cpp)</w:t>
             </w:r>
           </w:p>
         </w:tc>
@@ -3342,13 +3344,8 @@
             </w:tcMar>
           </w:tcPr>
           <w:p>
-            <w:proofErr w:type="spellStart"/>
-            <w:r>
-              <w:t>controller</w:t>
-            </w:r>
-            <w:proofErr w:type="spellEnd"/>
-            <w:r>
-              <w:t>/</w:t>
+            <w:r>
+              <w:t>controller/</w:t>
             </w:r>
           </w:p>
         </w:tc>
@@ -3370,53 +3367,8 @@
             </w:tcMar>
           </w:tcPr>
           <w:p>
-            <w:proofErr w:type="spellStart"/>
-            <w:r>
-              <w:t>PilotoController</w:t>
-            </w:r>
-            <w:proofErr w:type="spellEnd"/>
-            <w:r>
-              <w:t xml:space="preserve">, </w:t>
-            </w:r>
-            <w:proofErr w:type="spellStart"/>
-            <w:r>
-              <w:t>EquipaController</w:t>
-            </w:r>
-            <w:proofErr w:type="spellEnd"/>
-            <w:r>
-              <w:t xml:space="preserve">, </w:t>
-            </w:r>
-            <w:proofErr w:type="spellStart"/>
-            <w:r>
-              <w:t>VeiculoController</w:t>
-            </w:r>
-            <w:proofErr w:type="spellEnd"/>
-            <w:r>
-              <w:t xml:space="preserve">, </w:t>
-            </w:r>
-            <w:proofErr w:type="spellStart"/>
-            <w:r>
-              <w:t>CorridaController</w:t>
-            </w:r>
-            <w:proofErr w:type="spellEnd"/>
-            <w:r>
-              <w:t xml:space="preserve">, </w:t>
-            </w:r>
-            <w:proofErr w:type="spellStart"/>
-            <w:r>
-              <w:t>ParticipacaoController</w:t>
-            </w:r>
-            <w:proofErr w:type="spellEnd"/>
-            <w:r>
-              <w:t xml:space="preserve"> (.h / .</w:t>
-            </w:r>
-            <w:proofErr w:type="spellStart"/>
-            <w:r>
-              <w:t>cpp</w:t>
-            </w:r>
-            <w:proofErr w:type="spellEnd"/>
-            <w:r>
-              <w:t>)</w:t>
+            <w:r>
+              <w:t>PilotoController, EquipaController, VeiculoController, CorridaController, ParticipacaoController (.h / .cpp)</w:t>
             </w:r>
           </w:p>
         </w:tc>
@@ -3440,13 +3392,8 @@
             </w:tcMar>
           </w:tcPr>
           <w:p>
-            <w:proofErr w:type="spellStart"/>
-            <w:r>
-              <w:t>store</w:t>
-            </w:r>
-            <w:proofErr w:type="spellEnd"/>
-            <w:r>
-              <w:t>/</w:t>
+            <w:r>
+              <w:t>store/</w:t>
             </w:r>
           </w:p>
         </w:tc>
@@ -3468,53 +3415,8 @@
             </w:tcMar>
           </w:tcPr>
           <w:p>
-            <w:proofErr w:type="spellStart"/>
-            <w:r>
-              <w:t>PilotoStore</w:t>
-            </w:r>
-            <w:proofErr w:type="spellEnd"/>
-            <w:r>
-              <w:t xml:space="preserve">, </w:t>
-            </w:r>
-            <w:proofErr w:type="spellStart"/>
-            <w:r>
-              <w:t>EquipaStore</w:t>
-            </w:r>
-            <w:proofErr w:type="spellEnd"/>
-            <w:r>
-              <w:t xml:space="preserve">, </w:t>
-            </w:r>
-            <w:proofErr w:type="spellStart"/>
-            <w:r>
-              <w:t>VeiculoStore</w:t>
-            </w:r>
-            <w:proofErr w:type="spellEnd"/>
-            <w:r>
-              <w:t xml:space="preserve">, </w:t>
-            </w:r>
-            <w:proofErr w:type="spellStart"/>
-            <w:r>
-              <w:t>CorridaStore</w:t>
-            </w:r>
-            <w:proofErr w:type="spellEnd"/>
-            <w:r>
-              <w:t xml:space="preserve">, </w:t>
-            </w:r>
-            <w:proofErr w:type="spellStart"/>
-            <w:r>
-              <w:t>ParticipacaoStore</w:t>
-            </w:r>
-            <w:proofErr w:type="spellEnd"/>
-            <w:r>
-              <w:t xml:space="preserve"> (.h / .</w:t>
-            </w:r>
-            <w:proofErr w:type="spellStart"/>
-            <w:r>
-              <w:t>cpp</w:t>
-            </w:r>
-            <w:proofErr w:type="spellEnd"/>
-            <w:r>
-              <w:t>)</w:t>
+            <w:r>
+              <w:t>PilotoStore, EquipaStore, VeiculoStore, CorridaStore, ParticipacaoStore (.h / .cpp)</w:t>
             </w:r>
           </w:p>
         </w:tc>
@@ -3562,55 +3464,7 @@
           </w:tcPr>
           <w:p>
             <w:r>
-              <w:t xml:space="preserve">Menu, </w:t>
-            </w:r>
-            <w:proofErr w:type="spellStart"/>
-            <w:r>
-              <w:t>PilotoUI</w:t>
-            </w:r>
-            <w:proofErr w:type="spellEnd"/>
-            <w:r>
-              <w:t xml:space="preserve">, </w:t>
-            </w:r>
-            <w:proofErr w:type="spellStart"/>
-            <w:r>
-              <w:t>EquipaUI</w:t>
-            </w:r>
-            <w:proofErr w:type="spellEnd"/>
-            <w:r>
-              <w:t xml:space="preserve">, </w:t>
-            </w:r>
-            <w:proofErr w:type="spellStart"/>
-            <w:r>
-              <w:t>VeiculoUI</w:t>
-            </w:r>
-            <w:proofErr w:type="spellEnd"/>
-            <w:r>
-              <w:t xml:space="preserve">, </w:t>
-            </w:r>
-            <w:proofErr w:type="spellStart"/>
-            <w:r>
-              <w:t>CorridaUI</w:t>
-            </w:r>
-            <w:proofErr w:type="spellEnd"/>
-            <w:r>
-              <w:t xml:space="preserve">, </w:t>
-            </w:r>
-            <w:proofErr w:type="spellStart"/>
-            <w:r>
-              <w:t>ParticipacaoUI</w:t>
-            </w:r>
-            <w:proofErr w:type="spellEnd"/>
-            <w:r>
-              <w:t xml:space="preserve"> (.h / .</w:t>
-            </w:r>
-            <w:proofErr w:type="spellStart"/>
-            <w:r>
-              <w:t>cpp</w:t>
-            </w:r>
-            <w:proofErr w:type="spellEnd"/>
-            <w:r>
-              <w:t>)</w:t>
+              <w:t>Menu, PilotoUI, EquipaUI, VeiculoUI, CorridaUI, ParticipacaoUI (.h / .cpp)</w:t>
             </w:r>
           </w:p>
         </w:tc>
@@ -3658,31 +3512,7 @@
           </w:tcPr>
           <w:p>
             <w:r>
-              <w:t xml:space="preserve">Ficheiros binários gerados em </w:t>
-            </w:r>
-            <w:proofErr w:type="spellStart"/>
-            <w:r>
-              <w:t>runtime</w:t>
-            </w:r>
-            <w:proofErr w:type="spellEnd"/>
-            <w:r>
-              <w:t xml:space="preserve"> (</w:t>
-            </w:r>
-            <w:proofErr w:type="spellStart"/>
-            <w:r>
-              <w:t>pilotos.bin</w:t>
-            </w:r>
-            <w:proofErr w:type="spellEnd"/>
-            <w:r>
-              <w:t xml:space="preserve">, </w:t>
-            </w:r>
-            <w:proofErr w:type="spellStart"/>
-            <w:r>
-              <w:t>equipas.bin</w:t>
-            </w:r>
-            <w:proofErr w:type="spellEnd"/>
-            <w:r>
-              <w:t>, etc.)</w:t>
+              <w:t>Ficheiros binários gerados em runtime (pilotos.bin, equipas.bin, etc.)</w:t>
             </w:r>
           </w:p>
         </w:tc>
@@ -3727,39 +3557,7 @@
         <w:t xml:space="preserve">Carlos </w:t>
       </w:r>
       <w:r>
-        <w:t xml:space="preserve">Freitas: </w:t>
-      </w:r>
-      <w:proofErr w:type="spellStart"/>
-      <w:r>
-        <w:t>Requirements</w:t>
-      </w:r>
-      <w:proofErr w:type="spellEnd"/>
-      <w:r>
-        <w:t xml:space="preserve"> </w:t>
-      </w:r>
-      <w:proofErr w:type="spellStart"/>
-      <w:r>
-        <w:t>Engineering</w:t>
-      </w:r>
-      <w:proofErr w:type="spellEnd"/>
-      <w:r>
-        <w:t>/</w:t>
-      </w:r>
-      <w:proofErr w:type="spellStart"/>
-      <w:r>
-        <w:t>Analysis</w:t>
-      </w:r>
-      <w:proofErr w:type="spellEnd"/>
-      <w:r>
-        <w:t xml:space="preserve"> — FSOFT TP </w:t>
-      </w:r>
-      <w:proofErr w:type="spellStart"/>
-      <w:r>
-        <w:t>Week</w:t>
-      </w:r>
-      <w:proofErr w:type="spellEnd"/>
-      <w:r>
-        <w:t xml:space="preserve"> 4. ISEP, Porto (2025).</w:t>
+        <w:t>Freitas: Requirements Engineering/Analysis — FSOFT TP Week 4. ISEP, Porto (2025).</w:t>
       </w:r>
     </w:p>
     <w:sectPr>
@@ -4580,6 +4378,22 @@
       <w:szCs w:val="20"/>
     </w:rPr>
   </w:style>
+  <w:style w:type="table" w:styleId="TabelacomGrelha">
+    <w:name w:val="Table Grid"/>
+    <w:basedOn w:val="Tabelanormal"/>
+    <w:uiPriority w:val="39"/>
+    <w:rsid w:val="00B9328D"/>
+    <w:tblPr>
+      <w:tblBorders>
+        <w:top w:val="single" w:sz="4" w:space="0" w:color="auto"/>
+        <w:left w:val="single" w:sz="4" w:space="0" w:color="auto"/>
+        <w:bottom w:val="single" w:sz="4" w:space="0" w:color="auto"/>
+        <w:right w:val="single" w:sz="4" w:space="0" w:color="auto"/>
+        <w:insideH w:val="single" w:sz="4" w:space="0" w:color="auto"/>
+        <w:insideV w:val="single" w:sz="4" w:space="0" w:color="auto"/>
+      </w:tblBorders>
+    </w:tblPr>
+  </w:style>
 </w:styles>
 </file>
 
@@ -4899,23 +4713,6 @@
 </file>
 
 <file path=customXml/item1.xml><?xml version="1.0" encoding="utf-8"?>
-<p:properties xmlns:p="http://schemas.microsoft.com/office/2006/metadata/properties" xmlns:xsi="http://www.w3.org/2001/XMLSchema-instance" xmlns:pc="http://schemas.microsoft.com/office/infopath/2007/PartnerControls">
-  <documentManagement>
-    <_activity xmlns="0dcc1a40-ea0e-47d8-a039-1dac49932a50" xsi:nil="true"/>
-  </documentManagement>
-</p:properties>
-</file>
-
-<file path=customXml/item2.xml><?xml version="1.0" encoding="utf-8"?>
-<?mso-contentType ?>
-<FormTemplates xmlns="http://schemas.microsoft.com/sharepoint/v3/contenttype/forms">
-  <Display>DocumentLibraryForm</Display>
-  <Edit>DocumentLibraryForm</Edit>
-  <New>DocumentLibraryForm</New>
-</FormTemplates>
-</file>
-
-<file path=customXml/item3.xml><?xml version="1.0" encoding="utf-8"?>
 <ct:contentTypeSchema xmlns:ct="http://schemas.microsoft.com/office/2006/metadata/contentType" xmlns:ma="http://schemas.microsoft.com/office/2006/metadata/properties/metaAttributes" ct:_="" ma:_="" ma:contentTypeName="Document" ma:contentTypeID="0x01010084FBBC41F098C44BA41DB754347C7BC3" ma:contentTypeVersion="6" ma:contentTypeDescription="Create a new document." ma:contentTypeScope="" ma:versionID="192c9ba2479eb5323960d55e1076841e">
   <xsd:schema xmlns:xsd="http://www.w3.org/2001/XMLSchema" xmlns:xs="http://www.w3.org/2001/XMLSchema" xmlns:p="http://schemas.microsoft.com/office/2006/metadata/properties" xmlns:ns3="0dcc1a40-ea0e-47d8-a039-1dac49932a50" targetNamespace="http://schemas.microsoft.com/office/2006/metadata/properties" ma:root="true" ma:fieldsID="538bd0c5fa219a5e681903271b05c9bc" ns3:_="">
     <xsd:import namespace="0dcc1a40-ea0e-47d8-a039-1dac49932a50"/>
@@ -5071,25 +4868,24 @@
 </ct:contentTypeSchema>
 </file>
 
-<file path=customXml/itemProps1.xml><?xml version="1.0" encoding="utf-8"?>
-<ds:datastoreItem xmlns:ds="http://schemas.openxmlformats.org/officeDocument/2006/customXml" ds:itemID="{215D48A3-1F03-496E-8438-941A494C4533}">
-  <ds:schemaRefs>
-    <ds:schemaRef ds:uri="http://schemas.microsoft.com/office/2006/metadata/properties"/>
-    <ds:schemaRef ds:uri="http://schemas.microsoft.com/office/infopath/2007/PartnerControls"/>
-    <ds:schemaRef ds:uri="0dcc1a40-ea0e-47d8-a039-1dac49932a50"/>
-  </ds:schemaRefs>
-</ds:datastoreItem>
+<file path=customXml/item2.xml><?xml version="1.0" encoding="utf-8"?>
+<?mso-contentType ?>
+<FormTemplates xmlns="http://schemas.microsoft.com/sharepoint/v3/contenttype/forms">
+  <Display>DocumentLibraryForm</Display>
+  <Edit>DocumentLibraryForm</Edit>
+  <New>DocumentLibraryForm</New>
+</FormTemplates>
 </file>
 
-<file path=customXml/itemProps2.xml><?xml version="1.0" encoding="utf-8"?>
-<ds:datastoreItem xmlns:ds="http://schemas.openxmlformats.org/officeDocument/2006/customXml" ds:itemID="{0CA7B765-6DF9-49EC-BD22-E21135EF939E}">
-  <ds:schemaRefs>
-    <ds:schemaRef ds:uri="http://schemas.microsoft.com/sharepoint/v3/contenttype/forms"/>
-  </ds:schemaRefs>
-</ds:datastoreItem>
+<file path=customXml/item3.xml><?xml version="1.0" encoding="utf-8"?>
+<p:properties xmlns:p="http://schemas.microsoft.com/office/2006/metadata/properties" xmlns:xsi="http://www.w3.org/2001/XMLSchema-instance" xmlns:pc="http://schemas.microsoft.com/office/infopath/2007/PartnerControls">
+  <documentManagement>
+    <_activity xmlns="0dcc1a40-ea0e-47d8-a039-1dac49932a50" xsi:nil="true"/>
+  </documentManagement>
+</p:properties>
 </file>
 
-<file path=customXml/itemProps3.xml><?xml version="1.0" encoding="utf-8"?>
+<file path=customXml/itemProps1.xml><?xml version="1.0" encoding="utf-8"?>
 <ds:datastoreItem xmlns:ds="http://schemas.openxmlformats.org/officeDocument/2006/customXml" ds:itemID="{F6ABFCA7-6E12-4013-8F34-339A8E91A759}">
   <ds:schemaRefs>
     <ds:schemaRef ds:uri="http://schemas.microsoft.com/office/2006/metadata/contentType"/>
@@ -5105,4 +4901,22 @@
     <ds:schemaRef ds:uri="http://schemas.microsoft.com/internal/obd"/>
   </ds:schemaRefs>
 </ds:datastoreItem>
+</file>
+
+<file path=customXml/itemProps2.xml><?xml version="1.0" encoding="utf-8"?>
+<ds:datastoreItem xmlns:ds="http://schemas.openxmlformats.org/officeDocument/2006/customXml" ds:itemID="{0CA7B765-6DF9-49EC-BD22-E21135EF939E}">
+  <ds:schemaRefs>
+    <ds:schemaRef ds:uri="http://schemas.microsoft.com/sharepoint/v3/contenttype/forms"/>
+  </ds:schemaRefs>
+</ds:datastoreItem>
+</file>
+
+<file path=customXml/itemProps3.xml><?xml version="1.0" encoding="utf-8"?>
+<ds:datastoreItem xmlns:ds="http://schemas.openxmlformats.org/officeDocument/2006/customXml" ds:itemID="{215D48A3-1F03-496E-8438-941A494C4533}">
+  <ds:schemaRefs>
+    <ds:schemaRef ds:uri="http://schemas.microsoft.com/office/2006/metadata/properties"/>
+    <ds:schemaRef ds:uri="http://schemas.microsoft.com/office/infopath/2007/PartnerControls"/>
+    <ds:schemaRef ds:uri="0dcc1a40-ea0e-47d8-a039-1dac49932a50"/>
+  </ds:schemaRefs>
+</ds:datastoreItem>
 </file>
</xml_diff>